<commit_message>
Add hour-of-day request profile figure from Azure 2024 code trace
Co-Authored-By: Claude Sonnet 5.5 <noreply@anthropic.com>
Claude-Session: https://claude.ai/code/session_01FypCZQhoAqpuV4uTAfwLSu
</commit_message>
<xml_diff>
--- a/ISR_Manuscript_Blinded_2_figs.docx
+++ b/ISR_Manuscript_Blinded_2_figs.docx
@@ -6291,7 +6291,74 @@
         <w:rPr>
           <w:rFonts w:eastAsia="Times New Roman" w:cs="Times New Roman"/>
         </w:rPr>
-        <w:t xml:space="preserve">We treat the hour-of-day profile of the 2024 trace as 24 equally likely phases, with V = 20 and unpriced demand equal to 1.4 times capacity. Under dedicated servers with c = 77, a flat price loses 14.7% of welfare relative to hour-by-hour first-best prices. The best two-level schedule loses 4.6%, with 14 off-peak hours at a toll of about 2.1 and 10 peak hours at about 10.6. Charging no price at all loses 44.1%. The two-level schedule therefore eliminates about 69% of the flat-price loss. Under batching at the measured β/α, a flat price loses 6.6% of welfare relative to hour-by-hour first-best prices. The best two-level schedule loses 1.3%, with 14 off-peak hours at a toll of about 3.4 and 10 peak hours at about 9.6, and charging no price loses 36.7%. The two-level schedule therefore eliminates about 81% of the flat-price loss.</w:t>
+        <w:t xml:space="preserve">We treat the hour-of-day profile of the 2024 trace as 24 equally likely phases, with V = 20 and unpriced demand equal to 1.4 times capacity. Under dedicated servers with c = 77, a flat price loses 14.7% of welfare relative to hour-by-hour first-best prices. The best two-level schedule loses 4.6%, with 14 off-peak hours at a toll of about 2.1 and 10 peak hours at about 10.6. Charging no price at all loses 44.1%. The two-level schedule therefore eliminates about 69% of the flat-price loss. Under batching at the measured β/α, a flat price loses 6.6% of welfare relative to hour-by-hour first-best prices. The best two-level schedule loses 1.3%, with 14 off-peak hours at a toll of about 3.4 and 10 peak hours at about 9.6, and charging no price loses 36.7%. The two-level schedule therefore eliminates about 81% of the flat-price loss. The profile is shown in Figure 3.</w:t>
+      </w:r>
+    </w:p>
+    <w:p>
+      <w:pPr>
+        <w:pStyle w:val="Normal"/>
+        <w:keepNext/>
+        <w:spacing w:before="120" w:after="80" w:line="240" w:lineRule="auto"/>
+        <w:jc w:val="center"/>
+        <w:rPr/>
+      </w:pPr>
+      <w:r>
+        <w:drawing>
+          <wp:inline distT="0" distB="0" distL="0" distR="0">
+            <wp:extent cx="5486400" cy="3291840"/>
+            <wp:docPr id="905" name="Figure 3" descr="Line chart of mean requests per hour by hour of day (UTC): demand is lowest at about 24 thousand requests per hour at 08:00 to 09:00, rises sharply after 11:00, peaks at about 215 thousand at 19:00 and falls back overnight; the ten busiest hours are 13:00 to 22:00."/>
+            <wp:cNvGraphicFramePr>
+              <a:graphicFrameLocks xmlns:a="http://schemas.openxmlformats.org/drawingml/2006/main" noChangeAspect="1"/>
+            </wp:cNvGraphicFramePr>
+            <a:graphic xmlns:a="http://schemas.openxmlformats.org/drawingml/2006/main">
+              <a:graphicData uri="http://schemas.openxmlformats.org/drawingml/2006/picture">
+                <pic:pic xmlns:pic="http://schemas.openxmlformats.org/drawingml/2006/picture">
+                  <pic:nvPicPr>
+                    <pic:cNvPr id="905" name="figure5.png"/>
+                    <pic:cNvPicPr/>
+                  </pic:nvPicPr>
+                  <pic:blipFill>
+                    <a:blip r:embed="rIdFig5"/>
+                    <a:stretch>
+                      <a:fillRect/>
+                    </a:stretch>
+                  </pic:blipFill>
+                  <pic:spPr>
+                    <a:xfrm>
+                      <a:off x="0" y="0"/>
+                      <a:ext cx="5486400" cy="3291840"/>
+                    </a:xfrm>
+                    <a:prstGeom prst="rect">
+                      <a:avLst/>
+                    </a:prstGeom>
+                  </pic:spPr>
+                </pic:pic>
+              </a:graphicData>
+            </a:graphic>
+          </wp:inline>
+        </w:drawing>
+      </w:r>
+    </w:p>
+    <w:p>
+      <w:pPr>
+        <w:pStyle w:val="Normal"/>
+        <w:spacing w:before="120" w:after="80"/>
+        <w:jc w:val="left"/>
+        <w:rPr/>
+      </w:pPr>
+      <w:r>
+        <w:rPr>
+          <w:rFonts w:eastAsia="Times New Roman" w:cs="Times New Roman"/>
+          <w:b/>
+          <w:bCs/>
+        </w:rPr>
+        <w:t>Figure 3.</w:t>
+      </w:r>
+      <w:r>
+        <w:rPr>
+          <w:rFonts w:eastAsia="Times New Roman" w:cs="Times New Roman"/>
+        </w:rPr>
+        <w:t xml:space="preserve"> Hour-of-Day Request Profile, Azure 2024 Code Trace (Mean and Range over Seven Days, UTC)</w:t>
       </w:r>
     </w:p>
     <w:p>
@@ -7669,7 +7736,7 @@
         <w:rPr>
           <w:rFonts w:eastAsia="Times New Roman" w:cs="Times New Roman"/>
         </w:rPr>
-        <w:t xml:space="preserve">Under dedicated servers, the bound of Corollary 9(a) holds in all four configurations, although it is loose. The quadratic prediction overstates the exact recovery by 4 to 13 percentage points at G = 2 and by less at larger G, and it reproduces the pattern of diminishing returns (Figure 3). Two levels recover roughly two thirds of the loss, three levels about 80% to 85%, four levels 87% to 96% and six levels 95% to 99%. Under batching at the measured parameters, the bound of Corollary 9(a) holds as well, the quadratic prediction overstates the exact recovery by less than one percentage point, and two levels recover about 81% of the loss, three levels 91%, four levels 95% to 96% and six levels 99%.</w:t>
+        <w:t xml:space="preserve">Under dedicated servers, the bound of Corollary 9(a) holds in all four configurations, although it is loose. The quadratic prediction overstates the exact recovery by 4 to 13 percentage points at G = 2 and by less at larger G, and it reproduces the pattern of diminishing returns (Figure 4). Two levels recover roughly two thirds of the loss, three levels about 80% to 85%, four levels 87% to 96% and six levels 95% to 99%. Under batching at the measured parameters, the bound of Corollary 9(a) holds as well, the quadratic prediction overstates the exact recovery by less than one percentage point, and two levels recover about 81% of the loss, three levels 91%, four levels 95% to 96% and six levels 99%.</w:t>
       </w:r>
     </w:p>
     <w:p>
@@ -7684,7 +7751,7 @@
         <w:drawing>
           <wp:inline distT="0" distB="0" distL="0" distR="0">
             <wp:extent cx="5486400" cy="3291840"/>
-            <wp:docPr id="901" name="Figure 3" descr="Line chart: the share of the flat-price loss recovered rises steeply from two to three price levels and approaches one by six levels; batching recovers more than dedicated servers at two levels, and the quadratic prediction is close to the exact value under batching."/>
+            <wp:docPr id="901" name="Figure 4" descr="Line chart: the share of the flat-price loss recovered rises steeply from two to three price levels and approaches one by six levels; batching recovers more than dedicated servers at two levels, and the quadratic prediction is close to the exact value under batching."/>
             <wp:cNvGraphicFramePr>
               <a:graphicFrameLocks xmlns:a="http://schemas.openxmlformats.org/drawingml/2006/main" noChangeAspect="1"/>
             </wp:cNvGraphicFramePr>
@@ -7730,7 +7797,7 @@
           <w:b/>
           <w:bCs/>
         </w:rPr>
-        <w:t>Figure 3.</w:t>
+        <w:t>Figure 4.</w:t>
       </w:r>
       <w:r>
         <w:rPr>
@@ -7761,7 +7828,7 @@
         <w:rPr>
           <w:rFonts w:eastAsia="Times New Roman" w:cs="Times New Roman"/>
         </w:rPr>
-        <w:t>We scale the dwell times of the code-trace MMPP by a factor f and compute the loss of the best flat price relative to the best phase-dependent plan, using the exact Markov chain with equilibrium demand and the tagged-request delays (7), a buffer of N = 500 for the 7 dedicated servers and N = 2,000 for the batched engine (M = 1,024, measured β/α), V = 20 and unpriced demand 1.4 times capacity as in Section 6.2 (Table 3 and Figure 4).</w:t>
+        <w:t>We scale the dwell times of the code-trace MMPP by a factor f and compute the loss of the best flat price relative to the best phase-dependent plan, using the exact Markov chain with equilibrium demand and the tagged-request delays (7), a buffer of N = 500 for the 7 dedicated servers and N = 2,000 for the batched engine (M = 1,024, measured β/α), V = 20 and unpriced demand 1.4 times capacity as in Section 6.2 (Table 3 and Figure 5).</w:t>
       </w:r>
     </w:p>
     <w:p>
@@ -8573,7 +8640,7 @@
         <w:drawing>
           <wp:inline distT="0" distB="0" distL="0" distR="0">
             <wp:extent cx="5486400" cy="3291840"/>
-            <wp:docPr id="902" name="Figure 4" descr="Line chart on a logarithmic burst-length axis: the flat-price loss is near zero for very short bursts, peaks at about 18% (dedicated servers) and 7% (batching) for bursts of two to four service times, and declines for longer bursts; batching lies below dedicated servers throughout."/>
+            <wp:docPr id="902" name="Figure 5" descr="Line chart on a logarithmic burst-length axis: the flat-price loss is near zero for very short bursts, peaks at about 18% (dedicated servers) and 7% (batching) for bursts of two to four service times, and declines for longer bursts; batching lies below dedicated servers throughout."/>
             <wp:cNvGraphicFramePr>
               <a:graphicFrameLocks xmlns:a="http://schemas.openxmlformats.org/drawingml/2006/main" noChangeAspect="1"/>
             </wp:cNvGraphicFramePr>
@@ -8619,7 +8686,7 @@
           <w:b/>
           <w:bCs/>
         </w:rPr>
-        <w:t>Figure 4.</w:t>
+        <w:t>Figure 5.</w:t>
       </w:r>
       <w:r>
         <w:rPr>

</xml_diff>

<commit_message>
Add profit-maximizing provider analysis (Sec 4.5, Sec 6.7, Table 4) and code
Co-Authored-By: Claude Sonnet 5.5 <noreply@anthropic.com>
Claude-Session: https://claude.ai/code/session_01FypCZQhoAqpuV4uTAfwLSu
</commit_message>
<xml_diff>
--- a/ISR_Manuscript_Blinded_2_figs.docx
+++ b/ISR_Manuscript_Blinded_2_figs.docx
@@ -1324,7 +1324,7 @@
         <w:rPr>
           <w:rFonts w:eastAsia="Times New Roman" w:cs="Times New Roman"/>
         </w:rPr>
-        <w:t>We adopt welfare as the objective for two reasons. It is the benchmark that the congestion-pricing literature in IS uses to judge chargeback and pricing rules, and it is the natural objective of an internal platform that charges business units in order to allocate shared capacity. It also separates the inefficiency caused by the time-invariance of a price from the distributional question of who captures the surplus. Section 8 notes that, with competing providers, phase-dependent prices can raise profits without raising welfare.</w:t>
+        <w:t>We adopt welfare as the objective for two reasons. It is the benchmark that the congestion-pricing literature in IS uses to judge chargeback and pricing rules, and it is the natural objective of an internal platform that charges business units in order to allocate shared capacity. It also separates the inefficiency caused by the time-invariance of a price from the distributional question of who captures the surplus. Section 4.5 and Section 6.7 treat a revenue-maximizing provider, and Section 8 notes that, with competing providers, phase-dependent prices can raise profits without raising welfare.</w:t>
       </w:r>
     </w:p>
     <w:p>
@@ -1349,7 +1349,7 @@
         <w:rPr>
           <w:rFonts w:eastAsia="Times New Roman" w:cs="Times New Roman"/>
         </w:rPr>
-        <w:t>This section answers RQ1 and RQ2 analytically. Section 4.1 establishes the properties of delay and toll under batching, Section 4.2 characterizes first-best prices and the loss of a flat price in the quasi-static model, Section 4.3 examines how that loss depends on the speed at which phases switch, and Section 4.4 studies schedules with a small number of price levels. Proofs are in Online Appendix A.</w:t>
+        <w:t>This section answers RQ1 and RQ2 analytically. Section 4.1 establishes the properties of delay and toll under batching, Section 4.2 characterizes first-best prices and the loss of a flat price in the quasi-static model, Section 4.3 examines how that loss depends on the speed at which phases switch, and Section 4.4 studies schedules with a small number of price levels, and Section 4.5 turns to a revenue-maximizing provider. Proofs are in Online Appendix A.</w:t>
       </w:r>
     </w:p>
     <w:p>
@@ -4820,6 +4820,2011 @@
           <w:rFonts w:eastAsia="Times New Roman" w:cs="Times New Roman"/>
         </w:rPr>
         <w:t>Corollary 9(a) yields 3/4 for uniformly spread tolls and 2/π ≈ 0.64 for approximately Gaussian spreads. Both bounds are exact only in the quadratic model. A guarantee for the true welfare curves can be obtained from curvature bounds (Online Appendix A). In our calibration, however, the local curvatures range from about 1 to about 200, which makes that guarantee vacuous, and we therefore do not rely on it.</w:t>
+      </w:r>
+    </w:p>
+    <w:p>
+      <w:pPr>
+        <w:pStyle w:val="Heading2"/>
+        <w:rPr/>
+      </w:pPr>
+      <w:r>
+        <w:rPr>
+          <w:rFonts w:eastAsia="Times New Roman" w:cs="Times New Roman" w:ascii="Times New Roman" w:hAnsi="Times New Roman"/>
+        </w:rPr>
+        <w:t>4.5 A Profit-Maximizing Provider</w:t>
+      </w:r>
+    </w:p>
+    <w:p>
+      <w:pPr>
+        <w:pStyle w:val="Normal"/>
+        <w:jc w:val="both"/>
+        <w:rPr/>
+      </w:pPr>
+      <w:r>
+        <w:rPr>
+          <w:rFonts w:eastAsia="Times New Roman" w:cs="Times New Roman"/>
+        </w:rPr>
+        <w:t xml:space="preserve">The analysis so far takes the point of view of a planner, which is the relevant one for an internal platform that charges business units in order to allocate shared capacity. An external provider instead maximizes revenue. We set c</w:t>
+      </w:r>
+      <w:r>
+        <w:rPr>
+          <w:rFonts w:eastAsia="Times New Roman" w:cs="Times New Roman"/>
+          <w:vertAlign w:val="subscript"/>
+        </w:rPr>
+        <w:t xml:space="preserve">0</w:t>
+      </w:r>
+      <w:r>
+        <w:rPr>
+          <w:rFonts w:eastAsia="Times New Roman" w:cs="Times New Roman"/>
+        </w:rPr>
+        <w:t xml:space="preserve"> = 0 in this subsection; a positive serving cost is absorbed by replacing V with V − c</w:t>
+      </w:r>
+      <w:r>
+        <w:rPr>
+          <w:rFonts w:eastAsia="Times New Roman" w:cs="Times New Roman"/>
+          <w:vertAlign w:val="subscript"/>
+        </w:rPr>
+        <w:t xml:space="preserve">0</w:t>
+      </w:r>
+      <w:r>
+        <w:rPr>
+          <w:rFonts w:eastAsia="Times New Roman" w:cs="Times New Roman"/>
+        </w:rPr>
+        <w:t xml:space="preserve"> and Λ</w:t>
+      </w:r>
+      <w:r>
+        <w:rPr>
+          <w:rFonts w:eastAsia="Times New Roman" w:cs="Times New Roman"/>
+          <w:vertAlign w:val="subscript"/>
+        </w:rPr>
+        <w:t xml:space="preserve">k</w:t>
+      </w:r>
+      <w:r>
+        <w:rPr>
+          <w:rFonts w:eastAsia="Times New Roman" w:cs="Times New Roman"/>
+        </w:rPr>
+        <w:t xml:space="preserve"> with Λ</w:t>
+      </w:r>
+      <w:r>
+        <w:rPr>
+          <w:rFonts w:eastAsia="Times New Roman" w:cs="Times New Roman"/>
+          <w:vertAlign w:val="subscript"/>
+        </w:rPr>
+        <w:t xml:space="preserve">k</w:t>
+      </w:r>
+      <w:r>
+        <w:rPr>
+          <w:rFonts w:eastAsia="Times New Roman" w:cs="Times New Roman"/>
+        </w:rPr>
+        <w:t xml:space="preserve">(V − c</w:t>
+      </w:r>
+      <w:r>
+        <w:rPr>
+          <w:rFonts w:eastAsia="Times New Roman" w:cs="Times New Roman"/>
+          <w:vertAlign w:val="subscript"/>
+        </w:rPr>
+        <w:t xml:space="preserve">0</w:t>
+      </w:r>
+      <w:r>
+        <w:rPr>
+          <w:rFonts w:eastAsia="Times New Roman" w:cs="Times New Roman"/>
+        </w:rPr>
+        <w:t xml:space="preserve">)/V and by measuring the price as a margin over c</w:t>
+      </w:r>
+      <w:r>
+        <w:rPr>
+          <w:rFonts w:eastAsia="Times New Roman" w:cs="Times New Roman"/>
+          <w:vertAlign w:val="subscript"/>
+        </w:rPr>
+        <w:t xml:space="preserve">0</w:t>
+      </w:r>
+      <w:r>
+        <w:rPr>
+          <w:rFonts w:eastAsia="Times New Roman" w:cs="Times New Roman"/>
+        </w:rPr>
+        <w:t xml:space="preserve">. At rate λ, users pay the price P</w:t>
+      </w:r>
+      <w:r>
+        <w:rPr>
+          <w:rFonts w:eastAsia="Times New Roman" w:cs="Times New Roman"/>
+          <w:vertAlign w:val="subscript"/>
+        </w:rPr>
+        <w:t xml:space="preserve">k</w:t>
+      </w:r>
+      <w:r>
+        <w:rPr>
+          <w:rFonts w:eastAsia="Times New Roman" w:cs="Times New Roman"/>
+        </w:rPr>
+        <w:t xml:space="preserve">(λ) − d(λ), so revenue in phase k is pλ</w:t>
+      </w:r>
+      <w:r>
+        <w:rPr>
+          <w:rFonts w:eastAsia="Times New Roman" w:cs="Times New Roman"/>
+          <w:vertAlign w:val="subscript"/>
+        </w:rPr>
+        <w:t xml:space="preserve">k</w:t>
+      </w:r>
+      <w:r>
+        <w:rPr>
+          <w:rFonts w:eastAsia="Times New Roman" w:cs="Times New Roman"/>
+        </w:rPr>
+        <w:t xml:space="preserve">(p) = λP</w:t>
+      </w:r>
+      <w:r>
+        <w:rPr>
+          <w:rFonts w:eastAsia="Times New Roman" w:cs="Times New Roman"/>
+          <w:vertAlign w:val="subscript"/>
+        </w:rPr>
+        <w:t xml:space="preserve">k</w:t>
+      </w:r>
+      <w:r>
+        <w:rPr>
+          <w:rFonts w:eastAsia="Times New Roman" w:cs="Times New Roman"/>
+        </w:rPr>
+        <w:t xml:space="preserve">(λ) − D(λ) =: Ψ</w:t>
+      </w:r>
+      <w:r>
+        <w:rPr>
+          <w:rFonts w:eastAsia="Times New Roman" w:cs="Times New Roman"/>
+          <w:vertAlign w:val="subscript"/>
+        </w:rPr>
+        <w:t xml:space="preserve">k</w:t>
+      </w:r>
+      <w:r>
+        <w:rPr>
+          <w:rFonts w:eastAsia="Times New Roman" w:cs="Times New Roman"/>
+        </w:rPr>
+        <w:t xml:space="preserve">(λ). The provider’s problem is therefore the planner’s with the gross value B</w:t>
+      </w:r>
+      <w:r>
+        <w:rPr>
+          <w:rFonts w:eastAsia="Times New Roman" w:cs="Times New Roman"/>
+          <w:vertAlign w:val="subscript"/>
+        </w:rPr>
+        <w:t xml:space="preserve">k</w:t>
+      </w:r>
+      <w:r>
+        <w:rPr>
+          <w:rFonts w:eastAsia="Times New Roman" w:cs="Times New Roman"/>
+        </w:rPr>
+        <w:t xml:space="preserve">(λ) replaced by λP</w:t>
+      </w:r>
+      <w:r>
+        <w:rPr>
+          <w:rFonts w:eastAsia="Times New Roman" w:cs="Times New Roman"/>
+          <w:vertAlign w:val="subscript"/>
+        </w:rPr>
+        <w:t xml:space="preserve">k</w:t>
+      </w:r>
+      <w:r>
+        <w:rPr>
+          <w:rFonts w:eastAsia="Times New Roman" w:cs="Times New Roman"/>
+        </w:rPr>
+        <w:t xml:space="preserve">(λ), the revenue that a single price extracts at rate λ. Since λP</w:t>
+      </w:r>
+      <w:r>
+        <w:rPr>
+          <w:rFonts w:eastAsia="Times New Roman" w:cs="Times New Roman"/>
+          <w:vertAlign w:val="subscript"/>
+        </w:rPr>
+        <w:t xml:space="preserve">k</w:t>
+      </w:r>
+      <w:r>
+        <w:rPr>
+          <w:rFonts w:eastAsia="Times New Roman" w:cs="Times New Roman"/>
+        </w:rPr>
+        <w:t xml:space="preserve">(λ) is concave and D is strictly convex (Proposition 1), Ψ</w:t>
+      </w:r>
+      <w:r>
+        <w:rPr>
+          <w:rFonts w:eastAsia="Times New Roman" w:cs="Times New Roman"/>
+          <w:vertAlign w:val="subscript"/>
+        </w:rPr>
+        <w:t xml:space="preserve">k</w:t>
+      </w:r>
+      <w:r>
+        <w:rPr>
+          <w:rFonts w:eastAsia="Times New Roman" w:cs="Times New Roman"/>
+        </w:rPr>
+        <w:t xml:space="preserve"> is strictly concave, and its maximizer λ</w:t>
+      </w:r>
+      <w:r>
+        <w:rPr>
+          <w:rFonts w:eastAsia="Times New Roman" w:cs="Times New Roman"/>
+          <w:vertAlign w:val="superscript"/>
+        </w:rPr>
+        <w:t xml:space="preserve">m</w:t>
+      </w:r>
+      <w:r>
+        <w:rPr>
+          <w:rFonts w:eastAsia="Times New Roman" w:cs="Times New Roman"/>
+          <w:vertAlign w:val="subscript"/>
+        </w:rPr>
+        <w:t xml:space="preserve">k</w:t>
+      </w:r>
+      <w:r>
+        <w:rPr>
+          <w:rFonts w:eastAsia="Times New Roman" w:cs="Times New Roman"/>
+        </w:rPr>
+        <w:t xml:space="preserve"> &gt; 0 is the unique solution of</w:t>
+      </w:r>
+    </w:p>
+    <w:p>
+      <w:pPr>
+        <w:pStyle w:val="Normal"/>
+        <w:tabs>
+          <w:tab w:val="clear" w:pos="720"/>
+          <w:tab w:val="center" w:pos="4680" w:leader="none"/>
+          <w:tab w:val="right" w:pos="9360" w:leader="none"/>
+        </w:tabs>
+        <w:rPr/>
+      </w:pPr>
+      <w:r>
+        <w:rPr/>
+        <w:tab/>
+      </w:r>
+      <w:r>
+        <w:rPr>
+          <w:rFonts w:eastAsia="Times New Roman" w:cs="Times New Roman"/>
+        </w:rPr>
+        <w:t xml:space="preserve">V(1 − 2λ/Λ</w:t>
+      </w:r>
+      <w:r>
+        <w:rPr>
+          <w:rFonts w:eastAsia="Times New Roman" w:cs="Times New Roman"/>
+          <w:vertAlign w:val="subscript"/>
+        </w:rPr>
+        <w:t xml:space="preserve">k</w:t>
+      </w:r>
+      <w:r>
+        <w:rPr>
+          <w:rFonts w:eastAsia="Times New Roman" w:cs="Times New Roman"/>
+        </w:rPr>
+        <w:t xml:space="preserve">) = d(λ) + t(λ),</w:t>
+      </w:r>
+      <w:r>
+        <w:rPr/>
+        <w:tab/>
+      </w:r>
+      <w:r>
+        <w:rPr>
+          <w:rFonts w:eastAsia="Times New Roman" w:cs="Times New Roman"/>
+        </w:rPr>
+        <w:t xml:space="preserve">(10)</w:t>
+      </w:r>
+    </w:p>
+    <w:p>
+      <w:pPr>
+        <w:pStyle w:val="Normal"/>
+        <w:jc w:val="both"/>
+        <w:rPr/>
+      </w:pPr>
+      <w:r>
+        <w:rPr>
+          <w:rFonts w:eastAsia="Times New Roman" w:cs="Times New Roman"/>
+        </w:rPr>
+        <w:t xml:space="preserve">which is the condition P</w:t>
+      </w:r>
+      <w:r>
+        <w:rPr>
+          <w:rFonts w:eastAsia="Times New Roman" w:cs="Times New Roman"/>
+          <w:vertAlign w:val="subscript"/>
+        </w:rPr>
+        <w:t xml:space="preserve">k</w:t>
+      </w:r>
+      <w:r>
+        <w:rPr>
+          <w:rFonts w:eastAsia="Times New Roman" w:cs="Times New Roman"/>
+        </w:rPr>
+        <w:t xml:space="preserve">(λ) + λP</w:t>
+      </w:r>
+      <w:r>
+        <w:rPr>
+          <w:rFonts w:eastAsia="Times New Roman" w:cs="Times New Roman"/>
+          <w:vertAlign w:val="subscript"/>
+        </w:rPr>
+        <w:t xml:space="preserve">k</w:t>
+      </w:r>
+      <w:r>
+        <w:rPr>
+          <w:rFonts w:eastAsia="Times New Roman" w:cs="Times New Roman"/>
+        </w:rPr>
+        <w:t xml:space="preserve">′(λ) = D′(λ) that equates marginal revenue to the marginal congestion cost. The corresponding price is p</w:t>
+      </w:r>
+      <w:r>
+        <w:rPr>
+          <w:rFonts w:eastAsia="Times New Roman" w:cs="Times New Roman"/>
+          <w:vertAlign w:val="superscript"/>
+        </w:rPr>
+        <w:t xml:space="preserve">m</w:t>
+      </w:r>
+      <w:r>
+        <w:rPr>
+          <w:rFonts w:eastAsia="Times New Roman" w:cs="Times New Roman"/>
+          <w:vertAlign w:val="subscript"/>
+        </w:rPr>
+        <w:t xml:space="preserve">k</w:t>
+      </w:r>
+      <w:r>
+        <w:rPr>
+          <w:rFonts w:eastAsia="Times New Roman" w:cs="Times New Roman"/>
+        </w:rPr>
+        <w:t xml:space="preserve"> = P</w:t>
+      </w:r>
+      <w:r>
+        <w:rPr>
+          <w:rFonts w:eastAsia="Times New Roman" w:cs="Times New Roman"/>
+          <w:vertAlign w:val="subscript"/>
+        </w:rPr>
+        <w:t xml:space="preserve">k</w:t>
+      </w:r>
+      <w:r>
+        <w:rPr>
+          <w:rFonts w:eastAsia="Times New Roman" w:cs="Times New Roman"/>
+        </w:rPr>
+        <w:t xml:space="preserve">(λ</w:t>
+      </w:r>
+      <w:r>
+        <w:rPr>
+          <w:rFonts w:eastAsia="Times New Roman" w:cs="Times New Roman"/>
+          <w:vertAlign w:val="superscript"/>
+        </w:rPr>
+        <w:t xml:space="preserve">m</w:t>
+      </w:r>
+      <w:r>
+        <w:rPr>
+          <w:rFonts w:eastAsia="Times New Roman" w:cs="Times New Roman"/>
+          <w:vertAlign w:val="subscript"/>
+        </w:rPr>
+        <w:t xml:space="preserve">k</w:t>
+      </w:r>
+      <w:r>
+        <w:rPr>
+          <w:rFonts w:eastAsia="Times New Roman" w:cs="Times New Roman"/>
+        </w:rPr>
+        <w:t xml:space="preserve">) − d(λ</w:t>
+      </w:r>
+      <w:r>
+        <w:rPr>
+          <w:rFonts w:eastAsia="Times New Roman" w:cs="Times New Roman"/>
+          <w:vertAlign w:val="superscript"/>
+        </w:rPr>
+        <w:t xml:space="preserve">m</w:t>
+      </w:r>
+      <w:r>
+        <w:rPr>
+          <w:rFonts w:eastAsia="Times New Roman" w:cs="Times New Roman"/>
+          <w:vertAlign w:val="subscript"/>
+        </w:rPr>
+        <w:t xml:space="preserve">k</w:t>
+      </w:r>
+      <w:r>
+        <w:rPr>
+          <w:rFonts w:eastAsia="Times New Roman" w:cs="Times New Roman"/>
+        </w:rPr>
+        <w:t xml:space="preserve">), that is,</w:t>
+      </w:r>
+    </w:p>
+    <w:p>
+      <w:pPr>
+        <w:pStyle w:val="Normal"/>
+        <w:tabs>
+          <w:tab w:val="clear" w:pos="720"/>
+          <w:tab w:val="center" w:pos="4680" w:leader="none"/>
+          <w:tab w:val="right" w:pos="9360" w:leader="none"/>
+        </w:tabs>
+        <w:rPr/>
+      </w:pPr>
+      <w:r>
+        <w:rPr/>
+        <w:tab/>
+      </w:r>
+      <w:r>
+        <w:rPr>
+          <w:rFonts w:eastAsia="Times New Roman" w:cs="Times New Roman"/>
+        </w:rPr>
+        <w:t xml:space="preserve">p</w:t>
+      </w:r>
+      <w:r>
+        <w:rPr>
+          <w:rFonts w:eastAsia="Times New Roman" w:cs="Times New Roman"/>
+          <w:vertAlign w:val="superscript"/>
+        </w:rPr>
+        <w:t xml:space="preserve">m</w:t>
+      </w:r>
+      <w:r>
+        <w:rPr>
+          <w:rFonts w:eastAsia="Times New Roman" w:cs="Times New Roman"/>
+          <w:vertAlign w:val="subscript"/>
+        </w:rPr>
+        <w:t xml:space="preserve">k</w:t>
+      </w:r>
+      <w:r>
+        <w:rPr>
+          <w:rFonts w:eastAsia="Times New Roman" w:cs="Times New Roman"/>
+        </w:rPr>
+        <w:t xml:space="preserve"> = t(λ</w:t>
+      </w:r>
+      <w:r>
+        <w:rPr>
+          <w:rFonts w:eastAsia="Times New Roman" w:cs="Times New Roman"/>
+          <w:vertAlign w:val="superscript"/>
+        </w:rPr>
+        <w:t xml:space="preserve">m</w:t>
+      </w:r>
+      <w:r>
+        <w:rPr>
+          <w:rFonts w:eastAsia="Times New Roman" w:cs="Times New Roman"/>
+          <w:vertAlign w:val="subscript"/>
+        </w:rPr>
+        <w:t xml:space="preserve">k</w:t>
+      </w:r>
+      <w:r>
+        <w:rPr>
+          <w:rFonts w:eastAsia="Times New Roman" w:cs="Times New Roman"/>
+        </w:rPr>
+        <w:t xml:space="preserve">) + Vλ</w:t>
+      </w:r>
+      <w:r>
+        <w:rPr>
+          <w:rFonts w:eastAsia="Times New Roman" w:cs="Times New Roman"/>
+          <w:vertAlign w:val="superscript"/>
+        </w:rPr>
+        <w:t xml:space="preserve">m</w:t>
+      </w:r>
+      <w:r>
+        <w:rPr>
+          <w:rFonts w:eastAsia="Times New Roman" w:cs="Times New Roman"/>
+          <w:vertAlign w:val="subscript"/>
+        </w:rPr>
+        <w:t xml:space="preserve">k</w:t>
+      </w:r>
+      <w:r>
+        <w:rPr>
+          <w:rFonts w:eastAsia="Times New Roman" w:cs="Times New Roman"/>
+        </w:rPr>
+        <w:t xml:space="preserve">/Λ</w:t>
+      </w:r>
+      <w:r>
+        <w:rPr>
+          <w:rFonts w:eastAsia="Times New Roman" w:cs="Times New Roman"/>
+          <w:vertAlign w:val="subscript"/>
+        </w:rPr>
+        <w:t xml:space="preserve">k</w:t>
+      </w:r>
+      <w:r>
+        <w:rPr>
+          <w:rFonts w:eastAsia="Times New Roman" w:cs="Times New Roman"/>
+        </w:rPr>
+        <w:t xml:space="preserve">.</w:t>
+      </w:r>
+      <w:r>
+        <w:rPr/>
+        <w:tab/>
+      </w:r>
+      <w:r>
+        <w:rPr>
+          <w:rFonts w:eastAsia="Times New Roman" w:cs="Times New Roman"/>
+        </w:rPr>
+        <w:t xml:space="preserve">(11)</w:t>
+      </w:r>
+    </w:p>
+    <w:p>
+      <w:pPr>
+        <w:pStyle w:val="Normal"/>
+        <w:jc w:val="both"/>
+        <w:rPr/>
+      </w:pPr>
+      <w:r>
+        <w:rPr>
+          <w:rFonts w:eastAsia="Times New Roman" w:cs="Times New Roman"/>
+          <w:b/>
+          <w:bCs/>
+        </w:rPr>
+        <w:t xml:space="preserve">Proposition 10 (Monopoly Schedule).</w:t>
+      </w:r>
+      <w:r>
+        <w:rPr>
+          <w:rFonts w:eastAsia="Times New Roman" w:cs="Times New Roman"/>
+        </w:rPr>
+        <w:t xml:space="preserve"> (a) The revenue-maximizing price in phase k is the toll at the monopoly rate plus the markup Vλ</w:t>
+      </w:r>
+      <w:r>
+        <w:rPr>
+          <w:rFonts w:eastAsia="Times New Roman" w:cs="Times New Roman"/>
+          <w:vertAlign w:val="superscript"/>
+        </w:rPr>
+        <w:t xml:space="preserve">m</w:t>
+      </w:r>
+      <w:r>
+        <w:rPr>
+          <w:rFonts w:eastAsia="Times New Roman" w:cs="Times New Roman"/>
+          <w:vertAlign w:val="subscript"/>
+        </w:rPr>
+        <w:t xml:space="preserve">k</w:t>
+      </w:r>
+      <w:r>
+        <w:rPr>
+          <w:rFonts w:eastAsia="Times New Roman" w:cs="Times New Roman"/>
+        </w:rPr>
+        <w:t xml:space="preserve">/Λ</w:t>
+      </w:r>
+      <w:r>
+        <w:rPr>
+          <w:rFonts w:eastAsia="Times New Roman" w:cs="Times New Roman"/>
+          <w:vertAlign w:val="subscript"/>
+        </w:rPr>
+        <w:t xml:space="preserve">k</w:t>
+      </w:r>
+      <w:r>
+        <w:rPr>
+          <w:rFonts w:eastAsia="Times New Roman" w:cs="Times New Roman"/>
+        </w:rPr>
+        <w:t xml:space="preserve">. (b) λ</w:t>
+      </w:r>
+      <w:r>
+        <w:rPr>
+          <w:rFonts w:eastAsia="Times New Roman" w:cs="Times New Roman"/>
+          <w:vertAlign w:val="superscript"/>
+        </w:rPr>
+        <w:t xml:space="preserve">m</w:t>
+      </w:r>
+      <w:r>
+        <w:rPr>
+          <w:rFonts w:eastAsia="Times New Roman" w:cs="Times New Roman"/>
+          <w:vertAlign w:val="subscript"/>
+        </w:rPr>
+        <w:t xml:space="preserve">k</w:t>
+      </w:r>
+      <w:r>
+        <w:rPr>
+          <w:rFonts w:eastAsia="Times New Roman" w:cs="Times New Roman"/>
+        </w:rPr>
+        <w:t xml:space="preserve"> &lt; λ*</w:t>
+      </w:r>
+      <w:r>
+        <w:rPr>
+          <w:rFonts w:eastAsia="Times New Roman" w:cs="Times New Roman"/>
+          <w:vertAlign w:val="subscript"/>
+        </w:rPr>
+        <w:t xml:space="preserve">k</w:t>
+      </w:r>
+      <w:r>
+        <w:rPr>
+          <w:rFonts w:eastAsia="Times New Roman" w:cs="Times New Roman"/>
+        </w:rPr>
+        <w:t xml:space="preserve"> and p</w:t>
+      </w:r>
+      <w:r>
+        <w:rPr>
+          <w:rFonts w:eastAsia="Times New Roman" w:cs="Times New Roman"/>
+          <w:vertAlign w:val="superscript"/>
+        </w:rPr>
+        <w:t xml:space="preserve">m</w:t>
+      </w:r>
+      <w:r>
+        <w:rPr>
+          <w:rFonts w:eastAsia="Times New Roman" w:cs="Times New Roman"/>
+          <w:vertAlign w:val="subscript"/>
+        </w:rPr>
+        <w:t xml:space="preserve">k</w:t>
+      </w:r>
+      <w:r>
+        <w:rPr>
+          <w:rFonts w:eastAsia="Times New Roman" w:cs="Times New Roman"/>
+        </w:rPr>
+        <w:t xml:space="preserve"> &gt; p*</w:t>
+      </w:r>
+      <w:r>
+        <w:rPr>
+          <w:rFonts w:eastAsia="Times New Roman" w:cs="Times New Roman"/>
+          <w:vertAlign w:val="subscript"/>
+        </w:rPr>
+        <w:t xml:space="preserve">k</w:t>
+      </w:r>
+      <w:r>
+        <w:rPr>
+          <w:rFonts w:eastAsia="Times New Roman" w:cs="Times New Roman"/>
+        </w:rPr>
+        <w:t xml:space="preserve"> for every k. (c) λ</w:t>
+      </w:r>
+      <w:r>
+        <w:rPr>
+          <w:rFonts w:eastAsia="Times New Roman" w:cs="Times New Roman"/>
+          <w:vertAlign w:val="superscript"/>
+        </w:rPr>
+        <w:t xml:space="preserve">m</w:t>
+      </w:r>
+      <w:r>
+        <w:rPr>
+          <w:rFonts w:eastAsia="Times New Roman" w:cs="Times New Roman"/>
+          <w:vertAlign w:val="subscript"/>
+        </w:rPr>
+        <w:t xml:space="preserve">k</w:t>
+      </w:r>
+      <w:r>
+        <w:rPr>
+          <w:rFonts w:eastAsia="Times New Roman" w:cs="Times New Roman"/>
+        </w:rPr>
+        <w:t xml:space="preserve"> is strictly increasing in Λ</w:t>
+      </w:r>
+      <w:r>
+        <w:rPr>
+          <w:rFonts w:eastAsia="Times New Roman" w:cs="Times New Roman"/>
+          <w:vertAlign w:val="subscript"/>
+        </w:rPr>
+        <w:t xml:space="preserve">k</w:t>
+      </w:r>
+      <w:r>
+        <w:rPr>
+          <w:rFonts w:eastAsia="Times New Roman" w:cs="Times New Roman"/>
+        </w:rPr>
+        <w:t xml:space="preserve">, and p</w:t>
+      </w:r>
+      <w:r>
+        <w:rPr>
+          <w:rFonts w:eastAsia="Times New Roman" w:cs="Times New Roman"/>
+          <w:vertAlign w:val="superscript"/>
+        </w:rPr>
+        <w:t xml:space="preserve">m</w:t>
+      </w:r>
+      <w:r>
+        <w:rPr>
+          <w:rFonts w:eastAsia="Times New Roman" w:cs="Times New Roman"/>
+          <w:vertAlign w:val="subscript"/>
+        </w:rPr>
+        <w:t xml:space="preserve">k</w:t>
+      </w:r>
+      <w:r>
+        <w:rPr>
+          <w:rFonts w:eastAsia="Times New Roman" w:cs="Times New Roman"/>
+        </w:rPr>
+        <w:t xml:space="preserve"> is nondecreasing in Λ</w:t>
+      </w:r>
+      <w:r>
+        <w:rPr>
+          <w:rFonts w:eastAsia="Times New Roman" w:cs="Times New Roman"/>
+          <w:vertAlign w:val="subscript"/>
+        </w:rPr>
+        <w:t xml:space="preserve">k</w:t>
+      </w:r>
+      <w:r>
+        <w:rPr>
+          <w:rFonts w:eastAsia="Times New Roman" w:cs="Times New Roman"/>
+        </w:rPr>
+        <w:t xml:space="preserve">, strictly increasing if d″ &gt; 0. As Λ</w:t>
+      </w:r>
+      <w:r>
+        <w:rPr>
+          <w:rFonts w:eastAsia="Times New Roman" w:cs="Times New Roman"/>
+          <w:vertAlign w:val="subscript"/>
+        </w:rPr>
+        <w:t xml:space="preserve">k</w:t>
+      </w:r>
+      <w:r>
+        <w:rPr>
+          <w:rFonts w:eastAsia="Times New Roman" w:cs="Times New Roman"/>
+        </w:rPr>
+        <w:t xml:space="preserve"> → 0, p</w:t>
+      </w:r>
+      <w:r>
+        <w:rPr>
+          <w:rFonts w:eastAsia="Times New Roman" w:cs="Times New Roman"/>
+          <w:vertAlign w:val="superscript"/>
+        </w:rPr>
+        <w:t xml:space="preserve">m</w:t>
+      </w:r>
+      <w:r>
+        <w:rPr>
+          <w:rFonts w:eastAsia="Times New Roman" w:cs="Times New Roman"/>
+          <w:vertAlign w:val="subscript"/>
+        </w:rPr>
+        <w:t xml:space="preserve">k</w:t>
+      </w:r>
+      <w:r>
+        <w:rPr>
+          <w:rFonts w:eastAsia="Times New Roman" w:cs="Times New Roman"/>
+        </w:rPr>
+        <w:t xml:space="preserve"> → (V − d(0))/2 = (V − 1)/2.</w:t>
+      </w:r>
+    </w:p>
+    <w:p>
+      <w:pPr>
+        <w:pStyle w:val="Normal"/>
+        <w:jc w:val="both"/>
+        <w:rPr/>
+      </w:pPr>
+      <w:r>
+        <w:rPr>
+          <w:rFonts w:eastAsia="Times New Roman" w:cs="Times New Roman"/>
+          <w:b/>
+          <w:bCs/>
+        </w:rPr>
+        <w:t xml:space="preserve">Proof.</w:t>
+      </w:r>
+      <w:r>
+        <w:rPr>
+          <w:rFonts w:eastAsia="Times New Roman" w:cs="Times New Roman"/>
+        </w:rPr>
+        <w:t xml:space="preserve"> Part (a) is (11). For (b), Ψ</w:t>
+      </w:r>
+      <w:r>
+        <w:rPr>
+          <w:rFonts w:eastAsia="Times New Roman" w:cs="Times New Roman"/>
+          <w:vertAlign w:val="subscript"/>
+        </w:rPr>
+        <w:t xml:space="preserve">k</w:t>
+      </w:r>
+      <w:r>
+        <w:rPr>
+          <w:rFonts w:eastAsia="Times New Roman" w:cs="Times New Roman"/>
+        </w:rPr>
+        <w:t xml:space="preserve">′(λ*</w:t>
+      </w:r>
+      <w:r>
+        <w:rPr>
+          <w:rFonts w:eastAsia="Times New Roman" w:cs="Times New Roman"/>
+          <w:vertAlign w:val="subscript"/>
+        </w:rPr>
+        <w:t xml:space="preserve">k</w:t>
+      </w:r>
+      <w:r>
+        <w:rPr>
+          <w:rFonts w:eastAsia="Times New Roman" w:cs="Times New Roman"/>
+        </w:rPr>
+        <w:t xml:space="preserve">) = P</w:t>
+      </w:r>
+      <w:r>
+        <w:rPr>
+          <w:rFonts w:eastAsia="Times New Roman" w:cs="Times New Roman"/>
+          <w:vertAlign w:val="subscript"/>
+        </w:rPr>
+        <w:t xml:space="preserve">k</w:t>
+      </w:r>
+      <w:r>
+        <w:rPr>
+          <w:rFonts w:eastAsia="Times New Roman" w:cs="Times New Roman"/>
+        </w:rPr>
+        <w:t xml:space="preserve">(λ*</w:t>
+      </w:r>
+      <w:r>
+        <w:rPr>
+          <w:rFonts w:eastAsia="Times New Roman" w:cs="Times New Roman"/>
+          <w:vertAlign w:val="subscript"/>
+        </w:rPr>
+        <w:t xml:space="preserve">k</w:t>
+      </w:r>
+      <w:r>
+        <w:rPr>
+          <w:rFonts w:eastAsia="Times New Roman" w:cs="Times New Roman"/>
+        </w:rPr>
+        <w:t xml:space="preserve">) + λ*</w:t>
+      </w:r>
+      <w:r>
+        <w:rPr>
+          <w:rFonts w:eastAsia="Times New Roman" w:cs="Times New Roman"/>
+          <w:vertAlign w:val="subscript"/>
+        </w:rPr>
+        <w:t xml:space="preserve">k</w:t>
+      </w:r>
+      <w:r>
+        <w:rPr>
+          <w:rFonts w:eastAsia="Times New Roman" w:cs="Times New Roman"/>
+        </w:rPr>
+        <w:t xml:space="preserve">P</w:t>
+      </w:r>
+      <w:r>
+        <w:rPr>
+          <w:rFonts w:eastAsia="Times New Roman" w:cs="Times New Roman"/>
+          <w:vertAlign w:val="subscript"/>
+        </w:rPr>
+        <w:t xml:space="preserve">k</w:t>
+      </w:r>
+      <w:r>
+        <w:rPr>
+          <w:rFonts w:eastAsia="Times New Roman" w:cs="Times New Roman"/>
+        </w:rPr>
+        <w:t xml:space="preserve">′(λ*</w:t>
+      </w:r>
+      <w:r>
+        <w:rPr>
+          <w:rFonts w:eastAsia="Times New Roman" w:cs="Times New Roman"/>
+          <w:vertAlign w:val="subscript"/>
+        </w:rPr>
+        <w:t xml:space="preserve">k</w:t>
+      </w:r>
+      <w:r>
+        <w:rPr>
+          <w:rFonts w:eastAsia="Times New Roman" w:cs="Times New Roman"/>
+        </w:rPr>
+        <w:t xml:space="preserve">) − D′(λ*</w:t>
+      </w:r>
+      <w:r>
+        <w:rPr>
+          <w:rFonts w:eastAsia="Times New Roman" w:cs="Times New Roman"/>
+          <w:vertAlign w:val="subscript"/>
+        </w:rPr>
+        <w:t xml:space="preserve">k</w:t>
+      </w:r>
+      <w:r>
+        <w:rPr>
+          <w:rFonts w:eastAsia="Times New Roman" w:cs="Times New Roman"/>
+        </w:rPr>
+        <w:t xml:space="preserve">) = −Vλ*</w:t>
+      </w:r>
+      <w:r>
+        <w:rPr>
+          <w:rFonts w:eastAsia="Times New Roman" w:cs="Times New Roman"/>
+          <w:vertAlign w:val="subscript"/>
+        </w:rPr>
+        <w:t xml:space="preserve">k</w:t>
+      </w:r>
+      <w:r>
+        <w:rPr>
+          <w:rFonts w:eastAsia="Times New Roman" w:cs="Times New Roman"/>
+        </w:rPr>
+        <w:t xml:space="preserve">/Λ</w:t>
+      </w:r>
+      <w:r>
+        <w:rPr>
+          <w:rFonts w:eastAsia="Times New Roman" w:cs="Times New Roman"/>
+          <w:vertAlign w:val="subscript"/>
+        </w:rPr>
+        <w:t xml:space="preserve">k</w:t>
+      </w:r>
+      <w:r>
+        <w:rPr>
+          <w:rFonts w:eastAsia="Times New Roman" w:cs="Times New Roman"/>
+        </w:rPr>
+        <w:t xml:space="preserve"> &lt; 0 because P</w:t>
+      </w:r>
+      <w:r>
+        <w:rPr>
+          <w:rFonts w:eastAsia="Times New Roman" w:cs="Times New Roman"/>
+          <w:vertAlign w:val="subscript"/>
+        </w:rPr>
+        <w:t xml:space="preserve">k</w:t>
+      </w:r>
+      <w:r>
+        <w:rPr>
+          <w:rFonts w:eastAsia="Times New Roman" w:cs="Times New Roman"/>
+        </w:rPr>
+        <w:t xml:space="preserve">(λ*</w:t>
+      </w:r>
+      <w:r>
+        <w:rPr>
+          <w:rFonts w:eastAsia="Times New Roman" w:cs="Times New Roman"/>
+          <w:vertAlign w:val="subscript"/>
+        </w:rPr>
+        <w:t xml:space="preserve">k</w:t>
+      </w:r>
+      <w:r>
+        <w:rPr>
+          <w:rFonts w:eastAsia="Times New Roman" w:cs="Times New Roman"/>
+        </w:rPr>
+        <w:t xml:space="preserve">) = D′(λ*</w:t>
+      </w:r>
+      <w:r>
+        <w:rPr>
+          <w:rFonts w:eastAsia="Times New Roman" w:cs="Times New Roman"/>
+          <w:vertAlign w:val="subscript"/>
+        </w:rPr>
+        <w:t xml:space="preserve">k</w:t>
+      </w:r>
+      <w:r>
+        <w:rPr>
+          <w:rFonts w:eastAsia="Times New Roman" w:cs="Times New Roman"/>
+        </w:rPr>
+        <w:t xml:space="preserve">), so the strictly concave Ψ</w:t>
+      </w:r>
+      <w:r>
+        <w:rPr>
+          <w:rFonts w:eastAsia="Times New Roman" w:cs="Times New Roman"/>
+          <w:vertAlign w:val="subscript"/>
+        </w:rPr>
+        <w:t xml:space="preserve">k</w:t>
+      </w:r>
+      <w:r>
+        <w:rPr>
+          <w:rFonts w:eastAsia="Times New Roman" w:cs="Times New Roman"/>
+        </w:rPr>
+        <w:t xml:space="preserve"> peaks to the left of λ*</w:t>
+      </w:r>
+      <w:r>
+        <w:rPr>
+          <w:rFonts w:eastAsia="Times New Roman" w:cs="Times New Roman"/>
+          <w:vertAlign w:val="subscript"/>
+        </w:rPr>
+        <w:t xml:space="preserve">k</w:t>
+      </w:r>
+      <w:r>
+        <w:rPr>
+          <w:rFonts w:eastAsia="Times New Roman" w:cs="Times New Roman"/>
+        </w:rPr>
+        <w:t xml:space="preserve">. Because λ</w:t>
+      </w:r>
+      <w:r>
+        <w:rPr>
+          <w:rFonts w:eastAsia="Times New Roman" w:cs="Times New Roman"/>
+          <w:vertAlign w:val="subscript"/>
+        </w:rPr>
+        <w:t xml:space="preserve">k</w:t>
+      </w:r>
+      <w:r>
+        <w:rPr>
+          <w:rFonts w:eastAsia="Times New Roman" w:cs="Times New Roman"/>
+        </w:rPr>
+        <w:t xml:space="preserve">(·) is strictly decreasing in the price, the smaller rate λ</w:t>
+      </w:r>
+      <w:r>
+        <w:rPr>
+          <w:rFonts w:eastAsia="Times New Roman" w:cs="Times New Roman"/>
+          <w:vertAlign w:val="superscript"/>
+        </w:rPr>
+        <w:t xml:space="preserve">m</w:t>
+      </w:r>
+      <w:r>
+        <w:rPr>
+          <w:rFonts w:eastAsia="Times New Roman" w:cs="Times New Roman"/>
+          <w:vertAlign w:val="subscript"/>
+        </w:rPr>
+        <w:t xml:space="preserve">k</w:t>
+      </w:r>
+      <w:r>
+        <w:rPr>
+          <w:rFonts w:eastAsia="Times New Roman" w:cs="Times New Roman"/>
+        </w:rPr>
+        <w:t xml:space="preserve"> is implemented by a higher price than p*</w:t>
+      </w:r>
+      <w:r>
+        <w:rPr>
+          <w:rFonts w:eastAsia="Times New Roman" w:cs="Times New Roman"/>
+          <w:vertAlign w:val="subscript"/>
+        </w:rPr>
+        <w:t xml:space="preserve">k</w:t>
+      </w:r>
+      <w:r>
+        <w:rPr>
+          <w:rFonts w:eastAsia="Times New Roman" w:cs="Times New Roman"/>
+        </w:rPr>
+        <w:t xml:space="preserve">. For (c), implicit differentiation of (10) gives dλ</w:t>
+      </w:r>
+      <w:r>
+        <w:rPr>
+          <w:rFonts w:eastAsia="Times New Roman" w:cs="Times New Roman"/>
+          <w:vertAlign w:val="superscript"/>
+        </w:rPr>
+        <w:t xml:space="preserve">m</w:t>
+      </w:r>
+      <w:r>
+        <w:rPr>
+          <w:rFonts w:eastAsia="Times New Roman" w:cs="Times New Roman"/>
+        </w:rPr>
+        <w:t xml:space="preserve">/dΛ = (2Vλ/Λ</w:t>
+      </w:r>
+      <w:r>
+        <w:rPr>
+          <w:rFonts w:eastAsia="Times New Roman" w:cs="Times New Roman"/>
+          <w:vertAlign w:val="superscript"/>
+        </w:rPr>
+        <w:t xml:space="preserve">2</w:t>
+      </w:r>
+      <w:r>
+        <w:rPr>
+          <w:rFonts w:eastAsia="Times New Roman" w:cs="Times New Roman"/>
+        </w:rPr>
+        <w:t xml:space="preserve">)/(2V/Λ + D″) &gt; 0, with D″ = d′ + t′ &gt; 0. Differentiating (11) and using t′ − d′ = λd″ gives dp</w:t>
+      </w:r>
+      <w:r>
+        <w:rPr>
+          <w:rFonts w:eastAsia="Times New Roman" w:cs="Times New Roman"/>
+          <w:vertAlign w:val="superscript"/>
+        </w:rPr>
+        <w:t xml:space="preserve">m</w:t>
+      </w:r>
+      <w:r>
+        <w:rPr>
+          <w:rFonts w:eastAsia="Times New Roman" w:cs="Times New Roman"/>
+        </w:rPr>
+        <w:t xml:space="preserve">/dΛ = (Vλ/Λ</w:t>
+      </w:r>
+      <w:r>
+        <w:rPr>
+          <w:rFonts w:eastAsia="Times New Roman" w:cs="Times New Roman"/>
+          <w:vertAlign w:val="superscript"/>
+        </w:rPr>
+        <w:t xml:space="preserve">2</w:t>
+      </w:r>
+      <w:r>
+        <w:rPr>
+          <w:rFonts w:eastAsia="Times New Roman" w:cs="Times New Roman"/>
+        </w:rPr>
+        <w:t xml:space="preserve">) λd″/(2V/Λ + d′ + t′) ≥ 0, with d″ ≥ 0 by Proposition 1. The limit follows from (10) with λ → 0, d(0) = 1 and D′(0) = d(0). ∎</w:t>
+      </w:r>
+    </w:p>
+    <w:p>
+      <w:pPr>
+        <w:pStyle w:val="Normal"/>
+        <w:jc w:val="both"/>
+        <w:rPr/>
+      </w:pPr>
+      <w:r>
+        <w:rPr>
+          <w:rFonts w:eastAsia="Times New Roman" w:cs="Times New Roman"/>
+          <w:b/>
+          <w:bCs/>
+        </w:rPr>
+        <w:t xml:space="preserve">Proposition 11 (Flat Revenue-Maximizing Price).</w:t>
+      </w:r>
+      <w:r>
+        <w:rPr>
+          <w:rFonts w:eastAsia="Times New Roman" w:cs="Times New Roman"/>
+        </w:rPr>
+        <w:t xml:space="preserve"> Let Π</w:t>
+      </w:r>
+      <w:r>
+        <w:rPr>
+          <w:rFonts w:eastAsia="Times New Roman" w:cs="Times New Roman"/>
+          <w:vertAlign w:val="subscript"/>
+        </w:rPr>
+        <w:t xml:space="preserve">k</w:t>
+      </w:r>
+      <w:r>
+        <w:rPr>
+          <w:rFonts w:eastAsia="Times New Roman" w:cs="Times New Roman"/>
+        </w:rPr>
+        <w:t xml:space="preserve">(p) = pλ</w:t>
+      </w:r>
+      <w:r>
+        <w:rPr>
+          <w:rFonts w:eastAsia="Times New Roman" w:cs="Times New Roman"/>
+          <w:vertAlign w:val="subscript"/>
+        </w:rPr>
+        <w:t xml:space="preserve">k</w:t>
+      </w:r>
+      <w:r>
+        <w:rPr>
+          <w:rFonts w:eastAsia="Times New Roman" w:cs="Times New Roman"/>
+        </w:rPr>
+        <w:t xml:space="preserve">(p). (a) Π</w:t>
+      </w:r>
+      <w:r>
+        <w:rPr>
+          <w:rFonts w:eastAsia="Times New Roman" w:cs="Times New Roman"/>
+          <w:vertAlign w:val="subscript"/>
+        </w:rPr>
+        <w:t xml:space="preserve">k</w:t>
+      </w:r>
+      <w:r>
+        <w:rPr>
+          <w:rFonts w:eastAsia="Times New Roman" w:cs="Times New Roman"/>
+        </w:rPr>
+        <w:t xml:space="preserve">′(p) = W</w:t>
+      </w:r>
+      <w:r>
+        <w:rPr>
+          <w:rFonts w:eastAsia="Times New Roman" w:cs="Times New Roman"/>
+          <w:vertAlign w:val="subscript"/>
+        </w:rPr>
+        <w:t xml:space="preserve">k</w:t>
+      </w:r>
+      <w:r>
+        <w:rPr>
+          <w:rFonts w:eastAsia="Times New Roman" w:cs="Times New Roman"/>
+        </w:rPr>
+        <w:t xml:space="preserve">′(p) + κ</w:t>
+      </w:r>
+      <w:r>
+        <w:rPr>
+          <w:rFonts w:eastAsia="Times New Roman" w:cs="Times New Roman"/>
+          <w:vertAlign w:val="subscript"/>
+        </w:rPr>
+        <w:t xml:space="preserve">k</w:t>
+      </w:r>
+      <w:r>
+        <w:rPr>
+          <w:rFonts w:eastAsia="Times New Roman" w:cs="Times New Roman"/>
+        </w:rPr>
+        <w:t xml:space="preserve">(p)Vλ</w:t>
+      </w:r>
+      <w:r>
+        <w:rPr>
+          <w:rFonts w:eastAsia="Times New Roman" w:cs="Times New Roman"/>
+          <w:vertAlign w:val="subscript"/>
+        </w:rPr>
+        <w:t xml:space="preserve">k</w:t>
+      </w:r>
+      <w:r>
+        <w:rPr>
+          <w:rFonts w:eastAsia="Times New Roman" w:cs="Times New Roman"/>
+        </w:rPr>
+        <w:t xml:space="preserve">(p)/Λ</w:t>
+      </w:r>
+      <w:r>
+        <w:rPr>
+          <w:rFonts w:eastAsia="Times New Roman" w:cs="Times New Roman"/>
+          <w:vertAlign w:val="subscript"/>
+        </w:rPr>
+        <w:t xml:space="preserve">k</w:t>
+      </w:r>
+      <w:r>
+        <w:rPr>
+          <w:rFonts w:eastAsia="Times New Roman" w:cs="Times New Roman"/>
+        </w:rPr>
+        <w:t xml:space="preserve">. (b) Π</w:t>
+      </w:r>
+      <w:r>
+        <w:rPr>
+          <w:rFonts w:eastAsia="Times New Roman" w:cs="Times New Roman"/>
+          <w:vertAlign w:val="subscript"/>
+        </w:rPr>
+        <w:t xml:space="preserve">k</w:t>
+      </w:r>
+      <w:r>
+        <w:rPr>
+          <w:rFonts w:eastAsia="Times New Roman" w:cs="Times New Roman"/>
+        </w:rPr>
+        <w:t xml:space="preserve"> is strictly increasing for p &lt; p</w:t>
+      </w:r>
+      <w:r>
+        <w:rPr>
+          <w:rFonts w:eastAsia="Times New Roman" w:cs="Times New Roman"/>
+          <w:vertAlign w:val="superscript"/>
+        </w:rPr>
+        <w:t xml:space="preserve">m</w:t>
+      </w:r>
+      <w:r>
+        <w:rPr>
+          <w:rFonts w:eastAsia="Times New Roman" w:cs="Times New Roman"/>
+          <w:vertAlign w:val="subscript"/>
+        </w:rPr>
+        <w:t xml:space="preserve">k</w:t>
+      </w:r>
+      <w:r>
+        <w:rPr>
+          <w:rFonts w:eastAsia="Times New Roman" w:cs="Times New Roman"/>
+        </w:rPr>
+        <w:t xml:space="preserve"> and strictly decreasing for p &gt; p</w:t>
+      </w:r>
+      <w:r>
+        <w:rPr>
+          <w:rFonts w:eastAsia="Times New Roman" w:cs="Times New Roman"/>
+          <w:vertAlign w:val="superscript"/>
+        </w:rPr>
+        <w:t xml:space="preserve">m</w:t>
+      </w:r>
+      <w:r>
+        <w:rPr>
+          <w:rFonts w:eastAsia="Times New Roman" w:cs="Times New Roman"/>
+          <w:vertAlign w:val="subscript"/>
+        </w:rPr>
+        <w:t xml:space="preserve">k</w:t>
+      </w:r>
+      <w:r>
+        <w:rPr>
+          <w:rFonts w:eastAsia="Times New Roman" w:cs="Times New Roman"/>
+        </w:rPr>
+        <w:t xml:space="preserve">. (c) If the p</w:t>
+      </w:r>
+      <w:r>
+        <w:rPr>
+          <w:rFonts w:eastAsia="Times New Roman" w:cs="Times New Roman"/>
+          <w:vertAlign w:val="superscript"/>
+        </w:rPr>
+        <w:t xml:space="preserve">m</w:t>
+      </w:r>
+      <w:r>
+        <w:rPr>
+          <w:rFonts w:eastAsia="Times New Roman" w:cs="Times New Roman"/>
+          <w:vertAlign w:val="subscript"/>
+        </w:rPr>
+        <w:t xml:space="preserve">k</w:t>
+      </w:r>
+      <w:r>
+        <w:rPr>
+          <w:rFonts w:eastAsia="Times New Roman" w:cs="Times New Roman"/>
+        </w:rPr>
+        <w:t xml:space="preserve"> are not all equal, every maximizer p</w:t>
+      </w:r>
+      <w:r>
+        <w:rPr>
+          <w:rFonts w:eastAsia="Times New Roman" w:cs="Times New Roman"/>
+          <w:vertAlign w:val="superscript"/>
+        </w:rPr>
+        <w:t xml:space="preserve">M</w:t>
+      </w:r>
+      <w:r>
+        <w:rPr>
+          <w:rFonts w:eastAsia="Times New Roman" w:cs="Times New Roman"/>
+        </w:rPr>
+        <w:t xml:space="preserve"> of Σ</w:t>
+      </w:r>
+      <w:r>
+        <w:rPr>
+          <w:rFonts w:eastAsia="Times New Roman" w:cs="Times New Roman"/>
+          <w:vertAlign w:val="subscript"/>
+        </w:rPr>
+        <w:t xml:space="preserve">k</w:t>
+      </w:r>
+      <w:r>
+        <w:rPr>
+          <w:rFonts w:eastAsia="Times New Roman" w:cs="Times New Roman"/>
+        </w:rPr>
+        <w:t xml:space="preserve"> π</w:t>
+      </w:r>
+      <w:r>
+        <w:rPr>
+          <w:rFonts w:eastAsia="Times New Roman" w:cs="Times New Roman"/>
+          <w:vertAlign w:val="subscript"/>
+        </w:rPr>
+        <w:t xml:space="preserve">k</w:t>
+      </w:r>
+      <w:r>
+        <w:rPr>
+          <w:rFonts w:eastAsia="Times New Roman" w:cs="Times New Roman"/>
+        </w:rPr>
+        <w:t xml:space="preserve">Π</w:t>
+      </w:r>
+      <w:r>
+        <w:rPr>
+          <w:rFonts w:eastAsia="Times New Roman" w:cs="Times New Roman"/>
+          <w:vertAlign w:val="subscript"/>
+        </w:rPr>
+        <w:t xml:space="preserve">k</w:t>
+      </w:r>
+      <w:r>
+        <w:rPr>
+          <w:rFonts w:eastAsia="Times New Roman" w:cs="Times New Roman"/>
+        </w:rPr>
+        <w:t xml:space="preserve">(p) satisfies min</w:t>
+      </w:r>
+      <w:r>
+        <w:rPr>
+          <w:rFonts w:eastAsia="Times New Roman" w:cs="Times New Roman"/>
+          <w:vertAlign w:val="subscript"/>
+        </w:rPr>
+        <w:t xml:space="preserve">k</w:t>
+      </w:r>
+      <w:r>
+        <w:rPr>
+          <w:rFonts w:eastAsia="Times New Roman" w:cs="Times New Roman"/>
+        </w:rPr>
+        <w:t xml:space="preserve"> p</w:t>
+      </w:r>
+      <w:r>
+        <w:rPr>
+          <w:rFonts w:eastAsia="Times New Roman" w:cs="Times New Roman"/>
+          <w:vertAlign w:val="superscript"/>
+        </w:rPr>
+        <w:t xml:space="preserve">m</w:t>
+      </w:r>
+      <w:r>
+        <w:rPr>
+          <w:rFonts w:eastAsia="Times New Roman" w:cs="Times New Roman"/>
+          <w:vertAlign w:val="subscript"/>
+        </w:rPr>
+        <w:t xml:space="preserve">k</w:t>
+      </w:r>
+      <w:r>
+        <w:rPr>
+          <w:rFonts w:eastAsia="Times New Roman" w:cs="Times New Roman"/>
+        </w:rPr>
+        <w:t xml:space="preserve"> &lt; p</w:t>
+      </w:r>
+      <w:r>
+        <w:rPr>
+          <w:rFonts w:eastAsia="Times New Roman" w:cs="Times New Roman"/>
+          <w:vertAlign w:val="superscript"/>
+        </w:rPr>
+        <w:t xml:space="preserve">M</w:t>
+      </w:r>
+      <w:r>
+        <w:rPr>
+          <w:rFonts w:eastAsia="Times New Roman" w:cs="Times New Roman"/>
+        </w:rPr>
+        <w:t xml:space="preserve"> &lt; max</w:t>
+      </w:r>
+      <w:r>
+        <w:rPr>
+          <w:rFonts w:eastAsia="Times New Roman" w:cs="Times New Roman"/>
+          <w:vertAlign w:val="subscript"/>
+        </w:rPr>
+        <w:t xml:space="preserve">k</w:t>
+      </w:r>
+      <w:r>
+        <w:rPr>
+          <w:rFonts w:eastAsia="Times New Roman" w:cs="Times New Roman"/>
+        </w:rPr>
+        <w:t xml:space="preserve"> p</w:t>
+      </w:r>
+      <w:r>
+        <w:rPr>
+          <w:rFonts w:eastAsia="Times New Roman" w:cs="Times New Roman"/>
+          <w:vertAlign w:val="superscript"/>
+        </w:rPr>
+        <w:t xml:space="preserve">m</w:t>
+      </w:r>
+      <w:r>
+        <w:rPr>
+          <w:rFonts w:eastAsia="Times New Roman" w:cs="Times New Roman"/>
+          <w:vertAlign w:val="subscript"/>
+        </w:rPr>
+        <w:t xml:space="preserve">k</w:t>
+      </w:r>
+      <w:r>
+        <w:rPr>
+          <w:rFonts w:eastAsia="Times New Roman" w:cs="Times New Roman"/>
+        </w:rPr>
+        <w:t xml:space="preserve">, and the revenue gain from phase-dependent prices equals Σ</w:t>
+      </w:r>
+      <w:r>
+        <w:rPr>
+          <w:rFonts w:eastAsia="Times New Roman" w:cs="Times New Roman"/>
+          <w:vertAlign w:val="subscript"/>
+        </w:rPr>
+        <w:t xml:space="preserve">k</w:t>
+      </w:r>
+      <w:r>
+        <w:rPr>
+          <w:rFonts w:eastAsia="Times New Roman" w:cs="Times New Roman"/>
+        </w:rPr>
+        <w:t xml:space="preserve"> π</w:t>
+      </w:r>
+      <w:r>
+        <w:rPr>
+          <w:rFonts w:eastAsia="Times New Roman" w:cs="Times New Roman"/>
+          <w:vertAlign w:val="subscript"/>
+        </w:rPr>
+        <w:t xml:space="preserve">k</w:t>
+      </w:r>
+      <w:r>
+        <w:rPr>
+          <w:rFonts w:eastAsia="Times New Roman" w:cs="Times New Roman"/>
+        </w:rPr>
+        <w:t xml:space="preserve"> ∫ from p</w:t>
+      </w:r>
+      <w:r>
+        <w:rPr>
+          <w:rFonts w:eastAsia="Times New Roman" w:cs="Times New Roman"/>
+          <w:vertAlign w:val="superscript"/>
+        </w:rPr>
+        <w:t xml:space="preserve">M</w:t>
+      </w:r>
+      <w:r>
+        <w:rPr>
+          <w:rFonts w:eastAsia="Times New Roman" w:cs="Times New Roman"/>
+        </w:rPr>
+        <w:t xml:space="preserve"> to p</w:t>
+      </w:r>
+      <w:r>
+        <w:rPr>
+          <w:rFonts w:eastAsia="Times New Roman" w:cs="Times New Roman"/>
+          <w:vertAlign w:val="superscript"/>
+        </w:rPr>
+        <w:t xml:space="preserve">m</w:t>
+      </w:r>
+      <w:r>
+        <w:rPr>
+          <w:rFonts w:eastAsia="Times New Roman" w:cs="Times New Roman"/>
+          <w:vertAlign w:val="subscript"/>
+        </w:rPr>
+        <w:t xml:space="preserve">k</w:t>
+      </w:r>
+      <w:r>
+        <w:rPr>
+          <w:rFonts w:eastAsia="Times New Roman" w:cs="Times New Roman"/>
+        </w:rPr>
+        <w:t xml:space="preserve"> of Π</w:t>
+      </w:r>
+      <w:r>
+        <w:rPr>
+          <w:rFonts w:eastAsia="Times New Roman" w:cs="Times New Roman"/>
+          <w:vertAlign w:val="subscript"/>
+        </w:rPr>
+        <w:t xml:space="preserve">k</w:t>
+      </w:r>
+      <w:r>
+        <w:rPr>
+          <w:rFonts w:eastAsia="Times New Roman" w:cs="Times New Roman"/>
+        </w:rPr>
+        <w:t xml:space="preserve">′(s) ds &gt; 0. (d) W</w:t>
+      </w:r>
+      <w:r>
+        <w:rPr>
+          <w:rFonts w:eastAsia="Times New Roman" w:cs="Times New Roman"/>
+          <w:vertAlign w:val="subscript"/>
+        </w:rPr>
+        <w:t xml:space="preserve">k</w:t>
+      </w:r>
+      <w:r>
+        <w:rPr>
+          <w:rFonts w:eastAsia="Times New Roman" w:cs="Times New Roman"/>
+        </w:rPr>
+        <w:t xml:space="preserve">(p</w:t>
+      </w:r>
+      <w:r>
+        <w:rPr>
+          <w:rFonts w:eastAsia="Times New Roman" w:cs="Times New Roman"/>
+          <w:vertAlign w:val="superscript"/>
+        </w:rPr>
+        <w:t xml:space="preserve">m</w:t>
+      </w:r>
+      <w:r>
+        <w:rPr>
+          <w:rFonts w:eastAsia="Times New Roman" w:cs="Times New Roman"/>
+          <w:vertAlign w:val="subscript"/>
+        </w:rPr>
+        <w:t xml:space="preserve">k</w:t>
+      </w:r>
+      <w:r>
+        <w:rPr>
+          <w:rFonts w:eastAsia="Times New Roman" w:cs="Times New Roman"/>
+        </w:rPr>
+        <w:t xml:space="preserve">) &gt; W</w:t>
+      </w:r>
+      <w:r>
+        <w:rPr>
+          <w:rFonts w:eastAsia="Times New Roman" w:cs="Times New Roman"/>
+          <w:vertAlign w:val="subscript"/>
+        </w:rPr>
+        <w:t xml:space="preserve">k</w:t>
+      </w:r>
+      <w:r>
+        <w:rPr>
+          <w:rFonts w:eastAsia="Times New Roman" w:cs="Times New Roman"/>
+        </w:rPr>
+        <w:t xml:space="preserve">(p</w:t>
+      </w:r>
+      <w:r>
+        <w:rPr>
+          <w:rFonts w:eastAsia="Times New Roman" w:cs="Times New Roman"/>
+          <w:vertAlign w:val="superscript"/>
+        </w:rPr>
+        <w:t xml:space="preserve">M</w:t>
+      </w:r>
+      <w:r>
+        <w:rPr>
+          <w:rFonts w:eastAsia="Times New Roman" w:cs="Times New Roman"/>
+        </w:rPr>
+        <w:t xml:space="preserve">) for every phase with p*</w:t>
+      </w:r>
+      <w:r>
+        <w:rPr>
+          <w:rFonts w:eastAsia="Times New Roman" w:cs="Times New Roman"/>
+          <w:vertAlign w:val="subscript"/>
+        </w:rPr>
+        <w:t xml:space="preserve">k</w:t>
+      </w:r>
+      <w:r>
+        <w:rPr>
+          <w:rFonts w:eastAsia="Times New Roman" w:cs="Times New Roman"/>
+        </w:rPr>
+        <w:t xml:space="preserve"> &lt; p</w:t>
+      </w:r>
+      <w:r>
+        <w:rPr>
+          <w:rFonts w:eastAsia="Times New Roman" w:cs="Times New Roman"/>
+          <w:vertAlign w:val="superscript"/>
+        </w:rPr>
+        <w:t xml:space="preserve">m</w:t>
+      </w:r>
+      <w:r>
+        <w:rPr>
+          <w:rFonts w:eastAsia="Times New Roman" w:cs="Times New Roman"/>
+          <w:vertAlign w:val="subscript"/>
+        </w:rPr>
+        <w:t xml:space="preserve">k</w:t>
+      </w:r>
+      <w:r>
+        <w:rPr>
+          <w:rFonts w:eastAsia="Times New Roman" w:cs="Times New Roman"/>
+        </w:rPr>
+        <w:t xml:space="preserve"> &lt; p</w:t>
+      </w:r>
+      <w:r>
+        <w:rPr>
+          <w:rFonts w:eastAsia="Times New Roman" w:cs="Times New Roman"/>
+          <w:vertAlign w:val="superscript"/>
+        </w:rPr>
+        <w:t xml:space="preserve">M</w:t>
+      </w:r>
+      <w:r>
+        <w:rPr>
+          <w:rFonts w:eastAsia="Times New Roman" w:cs="Times New Roman"/>
+        </w:rPr>
+        <w:t xml:space="preserve">.</w:t>
+      </w:r>
+    </w:p>
+    <w:p>
+      <w:pPr>
+        <w:pStyle w:val="Normal"/>
+        <w:jc w:val="both"/>
+        <w:rPr/>
+      </w:pPr>
+      <w:r>
+        <w:rPr>
+          <w:rFonts w:eastAsia="Times New Roman" w:cs="Times New Roman"/>
+          <w:b/>
+          <w:bCs/>
+        </w:rPr>
+        <w:t xml:space="preserve">Proof.</w:t>
+      </w:r>
+      <w:r>
+        <w:rPr>
+          <w:rFonts w:eastAsia="Times New Roman" w:cs="Times New Roman"/>
+        </w:rPr>
+        <w:t xml:space="preserve"> Since Π</w:t>
+      </w:r>
+      <w:r>
+        <w:rPr>
+          <w:rFonts w:eastAsia="Times New Roman" w:cs="Times New Roman"/>
+          <w:vertAlign w:val="subscript"/>
+        </w:rPr>
+        <w:t xml:space="preserve">k</w:t>
+      </w:r>
+      <w:r>
+        <w:rPr>
+          <w:rFonts w:eastAsia="Times New Roman" w:cs="Times New Roman"/>
+        </w:rPr>
+        <w:t xml:space="preserve">′ = λ</w:t>
+      </w:r>
+      <w:r>
+        <w:rPr>
+          <w:rFonts w:eastAsia="Times New Roman" w:cs="Times New Roman"/>
+          <w:vertAlign w:val="subscript"/>
+        </w:rPr>
+        <w:t xml:space="preserve">k</w:t>
+      </w:r>
+      <w:r>
+        <w:rPr>
+          <w:rFonts w:eastAsia="Times New Roman" w:cs="Times New Roman"/>
+        </w:rPr>
+        <w:t xml:space="preserve"> − pκ</w:t>
+      </w:r>
+      <w:r>
+        <w:rPr>
+          <w:rFonts w:eastAsia="Times New Roman" w:cs="Times New Roman"/>
+          <w:vertAlign w:val="subscript"/>
+        </w:rPr>
+        <w:t xml:space="preserve">k</w:t>
+      </w:r>
+      <w:r>
+        <w:rPr>
+          <w:rFonts w:eastAsia="Times New Roman" w:cs="Times New Roman"/>
+        </w:rPr>
+        <w:t xml:space="preserve"> and W</w:t>
+      </w:r>
+      <w:r>
+        <w:rPr>
+          <w:rFonts w:eastAsia="Times New Roman" w:cs="Times New Roman"/>
+          <w:vertAlign w:val="subscript"/>
+        </w:rPr>
+        <w:t xml:space="preserve">k</w:t>
+      </w:r>
+      <w:r>
+        <w:rPr>
+          <w:rFonts w:eastAsia="Times New Roman" w:cs="Times New Roman"/>
+        </w:rPr>
+        <w:t xml:space="preserve">′ = −κ</w:t>
+      </w:r>
+      <w:r>
+        <w:rPr>
+          <w:rFonts w:eastAsia="Times New Roman" w:cs="Times New Roman"/>
+          <w:vertAlign w:val="subscript"/>
+        </w:rPr>
+        <w:t xml:space="preserve">k</w:t>
+      </w:r>
+      <w:r>
+        <w:rPr>
+          <w:rFonts w:eastAsia="Times New Roman" w:cs="Times New Roman"/>
+        </w:rPr>
+        <w:t xml:space="preserve">(p − t), the difference is λ</w:t>
+      </w:r>
+      <w:r>
+        <w:rPr>
+          <w:rFonts w:eastAsia="Times New Roman" w:cs="Times New Roman"/>
+          <w:vertAlign w:val="subscript"/>
+        </w:rPr>
+        <w:t xml:space="preserve">k</w:t>
+      </w:r>
+      <w:r>
+        <w:rPr>
+          <w:rFonts w:eastAsia="Times New Roman" w:cs="Times New Roman"/>
+        </w:rPr>
+        <w:t xml:space="preserve"> − κ</w:t>
+      </w:r>
+      <w:r>
+        <w:rPr>
+          <w:rFonts w:eastAsia="Times New Roman" w:cs="Times New Roman"/>
+          <w:vertAlign w:val="subscript"/>
+        </w:rPr>
+        <w:t xml:space="preserve">k</w:t>
+      </w:r>
+      <w:r>
+        <w:rPr>
+          <w:rFonts w:eastAsia="Times New Roman" w:cs="Times New Roman"/>
+        </w:rPr>
+        <w:t xml:space="preserve">t, and λ</w:t>
+      </w:r>
+      <w:r>
+        <w:rPr>
+          <w:rFonts w:eastAsia="Times New Roman" w:cs="Times New Roman"/>
+          <w:vertAlign w:val="subscript"/>
+        </w:rPr>
+        <w:t xml:space="preserve">k</w:t>
+      </w:r>
+      <w:r>
+        <w:rPr>
+          <w:rFonts w:eastAsia="Times New Roman" w:cs="Times New Roman"/>
+        </w:rPr>
+        <w:t xml:space="preserve">/κ</w:t>
+      </w:r>
+      <w:r>
+        <w:rPr>
+          <w:rFonts w:eastAsia="Times New Roman" w:cs="Times New Roman"/>
+          <w:vertAlign w:val="subscript"/>
+        </w:rPr>
+        <w:t xml:space="preserve">k</w:t>
+      </w:r>
+      <w:r>
+        <w:rPr>
+          <w:rFonts w:eastAsia="Times New Roman" w:cs="Times New Roman"/>
+        </w:rPr>
+        <w:t xml:space="preserve"> = λ</w:t>
+      </w:r>
+      <w:r>
+        <w:rPr>
+          <w:rFonts w:eastAsia="Times New Roman" w:cs="Times New Roman"/>
+          <w:vertAlign w:val="subscript"/>
+        </w:rPr>
+        <w:t xml:space="preserve">k</w:t>
+      </w:r>
+      <w:r>
+        <w:rPr>
+          <w:rFonts w:eastAsia="Times New Roman" w:cs="Times New Roman"/>
+        </w:rPr>
+        <w:t xml:space="preserve">(V/Λ</w:t>
+      </w:r>
+      <w:r>
+        <w:rPr>
+          <w:rFonts w:eastAsia="Times New Roman" w:cs="Times New Roman"/>
+          <w:vertAlign w:val="subscript"/>
+        </w:rPr>
+        <w:t xml:space="preserve">k</w:t>
+      </w:r>
+      <w:r>
+        <w:rPr>
+          <w:rFonts w:eastAsia="Times New Roman" w:cs="Times New Roman"/>
+        </w:rPr>
+        <w:t xml:space="preserve"> + d′(λ</w:t>
+      </w:r>
+      <w:r>
+        <w:rPr>
+          <w:rFonts w:eastAsia="Times New Roman" w:cs="Times New Roman"/>
+          <w:vertAlign w:val="subscript"/>
+        </w:rPr>
+        <w:t xml:space="preserve">k</w:t>
+      </w:r>
+      <w:r>
+        <w:rPr>
+          <w:rFonts w:eastAsia="Times New Roman" w:cs="Times New Roman"/>
+        </w:rPr>
+        <w:t xml:space="preserve">)) = Vλ</w:t>
+      </w:r>
+      <w:r>
+        <w:rPr>
+          <w:rFonts w:eastAsia="Times New Roman" w:cs="Times New Roman"/>
+          <w:vertAlign w:val="subscript"/>
+        </w:rPr>
+        <w:t xml:space="preserve">k</w:t>
+      </w:r>
+      <w:r>
+        <w:rPr>
+          <w:rFonts w:eastAsia="Times New Roman" w:cs="Times New Roman"/>
+        </w:rPr>
+        <w:t xml:space="preserve">/Λ</w:t>
+      </w:r>
+      <w:r>
+        <w:rPr>
+          <w:rFonts w:eastAsia="Times New Roman" w:cs="Times New Roman"/>
+          <w:vertAlign w:val="subscript"/>
+        </w:rPr>
+        <w:t xml:space="preserve">k</w:t>
+      </w:r>
+      <w:r>
+        <w:rPr>
+          <w:rFonts w:eastAsia="Times New Roman" w:cs="Times New Roman"/>
+        </w:rPr>
+        <w:t xml:space="preserve"> + t(λ</w:t>
+      </w:r>
+      <w:r>
+        <w:rPr>
+          <w:rFonts w:eastAsia="Times New Roman" w:cs="Times New Roman"/>
+          <w:vertAlign w:val="subscript"/>
+        </w:rPr>
+        <w:t xml:space="preserve">k</w:t>
+      </w:r>
+      <w:r>
+        <w:rPr>
+          <w:rFonts w:eastAsia="Times New Roman" w:cs="Times New Roman"/>
+        </w:rPr>
+        <w:t xml:space="preserve">), which gives (a). Part (b) holds because Π</w:t>
+      </w:r>
+      <w:r>
+        <w:rPr>
+          <w:rFonts w:eastAsia="Times New Roman" w:cs="Times New Roman"/>
+          <w:vertAlign w:val="subscript"/>
+        </w:rPr>
+        <w:t xml:space="preserve">k</w:t>
+      </w:r>
+      <w:r>
+        <w:rPr>
+          <w:rFonts w:eastAsia="Times New Roman" w:cs="Times New Roman"/>
+        </w:rPr>
+        <w:t xml:space="preserve">(p) = Ψ</w:t>
+      </w:r>
+      <w:r>
+        <w:rPr>
+          <w:rFonts w:eastAsia="Times New Roman" w:cs="Times New Roman"/>
+          <w:vertAlign w:val="subscript"/>
+        </w:rPr>
+        <w:t xml:space="preserve">k</w:t>
+      </w:r>
+      <w:r>
+        <w:rPr>
+          <w:rFonts w:eastAsia="Times New Roman" w:cs="Times New Roman"/>
+        </w:rPr>
+        <w:t xml:space="preserve">(λ</w:t>
+      </w:r>
+      <w:r>
+        <w:rPr>
+          <w:rFonts w:eastAsia="Times New Roman" w:cs="Times New Roman"/>
+          <w:vertAlign w:val="subscript"/>
+        </w:rPr>
+        <w:t xml:space="preserve">k</w:t>
+      </w:r>
+      <w:r>
+        <w:rPr>
+          <w:rFonts w:eastAsia="Times New Roman" w:cs="Times New Roman"/>
+        </w:rPr>
+        <w:t xml:space="preserve">(p)), where Ψ</w:t>
+      </w:r>
+      <w:r>
+        <w:rPr>
+          <w:rFonts w:eastAsia="Times New Roman" w:cs="Times New Roman"/>
+          <w:vertAlign w:val="subscript"/>
+        </w:rPr>
+        <w:t xml:space="preserve">k</w:t>
+      </w:r>
+      <w:r>
+        <w:rPr>
+          <w:rFonts w:eastAsia="Times New Roman" w:cs="Times New Roman"/>
+        </w:rPr>
+        <w:t xml:space="preserve"> increases up to λ</w:t>
+      </w:r>
+      <w:r>
+        <w:rPr>
+          <w:rFonts w:eastAsia="Times New Roman" w:cs="Times New Roman"/>
+          <w:vertAlign w:val="superscript"/>
+        </w:rPr>
+        <w:t xml:space="preserve">m</w:t>
+      </w:r>
+      <w:r>
+        <w:rPr>
+          <w:rFonts w:eastAsia="Times New Roman" w:cs="Times New Roman"/>
+          <w:vertAlign w:val="subscript"/>
+        </w:rPr>
+        <w:t xml:space="preserve">k</w:t>
+      </w:r>
+      <w:r>
+        <w:rPr>
+          <w:rFonts w:eastAsia="Times New Roman" w:cs="Times New Roman"/>
+        </w:rPr>
+        <w:t xml:space="preserve"> and decreases afterwards, while λ</w:t>
+      </w:r>
+      <w:r>
+        <w:rPr>
+          <w:rFonts w:eastAsia="Times New Roman" w:cs="Times New Roman"/>
+          <w:vertAlign w:val="subscript"/>
+        </w:rPr>
+        <w:t xml:space="preserve">k</w:t>
+      </w:r>
+      <w:r>
+        <w:rPr>
+          <w:rFonts w:eastAsia="Times New Roman" w:cs="Times New Roman"/>
+        </w:rPr>
+        <w:t xml:space="preserve">(p) is strictly decreasing in p. For (c), below min p</w:t>
+      </w:r>
+      <w:r>
+        <w:rPr>
+          <w:rFonts w:eastAsia="Times New Roman" w:cs="Times New Roman"/>
+          <w:vertAlign w:val="superscript"/>
+        </w:rPr>
+        <w:t xml:space="preserve">m</w:t>
+      </w:r>
+      <w:r>
+        <w:rPr>
+          <w:rFonts w:eastAsia="Times New Roman" w:cs="Times New Roman"/>
+          <w:vertAlign w:val="subscript"/>
+        </w:rPr>
+        <w:t xml:space="preserve">k</w:t>
+      </w:r>
+      <w:r>
+        <w:rPr>
+          <w:rFonts w:eastAsia="Times New Roman" w:cs="Times New Roman"/>
+        </w:rPr>
+        <w:t xml:space="preserve"> every Π</w:t>
+      </w:r>
+      <w:r>
+        <w:rPr>
+          <w:rFonts w:eastAsia="Times New Roman" w:cs="Times New Roman"/>
+          <w:vertAlign w:val="subscript"/>
+        </w:rPr>
+        <w:t xml:space="preserve">k</w:t>
+      </w:r>
+      <w:r>
+        <w:rPr>
+          <w:rFonts w:eastAsia="Times New Roman" w:cs="Times New Roman"/>
+        </w:rPr>
+        <w:t xml:space="preserve"> is strictly increasing and above max p</w:t>
+      </w:r>
+      <w:r>
+        <w:rPr>
+          <w:rFonts w:eastAsia="Times New Roman" w:cs="Times New Roman"/>
+          <w:vertAlign w:val="superscript"/>
+        </w:rPr>
+        <w:t xml:space="preserve">m</w:t>
+      </w:r>
+      <w:r>
+        <w:rPr>
+          <w:rFonts w:eastAsia="Times New Roman" w:cs="Times New Roman"/>
+          <w:vertAlign w:val="subscript"/>
+        </w:rPr>
+        <w:t xml:space="preserve">k</w:t>
+      </w:r>
+      <w:r>
+        <w:rPr>
+          <w:rFonts w:eastAsia="Times New Roman" w:cs="Times New Roman"/>
+        </w:rPr>
+        <w:t xml:space="preserve"> every Π</w:t>
+      </w:r>
+      <w:r>
+        <w:rPr>
+          <w:rFonts w:eastAsia="Times New Roman" w:cs="Times New Roman"/>
+          <w:vertAlign w:val="subscript"/>
+        </w:rPr>
+        <w:t xml:space="preserve">k</w:t>
+      </w:r>
+      <w:r>
+        <w:rPr>
+          <w:rFonts w:eastAsia="Times New Roman" w:cs="Times New Roman"/>
+        </w:rPr>
+        <w:t xml:space="preserve"> is strictly decreasing, so p</w:t>
+      </w:r>
+      <w:r>
+        <w:rPr>
+          <w:rFonts w:eastAsia="Times New Roman" w:cs="Times New Roman"/>
+          <w:vertAlign w:val="superscript"/>
+        </w:rPr>
+        <w:t xml:space="preserve">M</w:t>
+      </w:r>
+      <w:r>
+        <w:rPr>
+          <w:rFonts w:eastAsia="Times New Roman" w:cs="Times New Roman"/>
+        </w:rPr>
+        <w:t xml:space="preserve"> lies inside the interval; the expression for the gain is the fundamental theorem of calculus, and it is positive because each integrand has the sign of p</w:t>
+      </w:r>
+      <w:r>
+        <w:rPr>
+          <w:rFonts w:eastAsia="Times New Roman" w:cs="Times New Roman"/>
+          <w:vertAlign w:val="superscript"/>
+        </w:rPr>
+        <w:t xml:space="preserve">m</w:t>
+      </w:r>
+      <w:r>
+        <w:rPr>
+          <w:rFonts w:eastAsia="Times New Roman" w:cs="Times New Roman"/>
+          <w:vertAlign w:val="subscript"/>
+        </w:rPr>
+        <w:t xml:space="preserve">k</w:t>
+      </w:r>
+      <w:r>
+        <w:rPr>
+          <w:rFonts w:eastAsia="Times New Roman" w:cs="Times New Roman"/>
+        </w:rPr>
+        <w:t xml:space="preserve"> − p for p between p</w:t>
+      </w:r>
+      <w:r>
+        <w:rPr>
+          <w:rFonts w:eastAsia="Times New Roman" w:cs="Times New Roman"/>
+          <w:vertAlign w:val="superscript"/>
+        </w:rPr>
+        <w:t xml:space="preserve">M</w:t>
+      </w:r>
+      <w:r>
+        <w:rPr>
+          <w:rFonts w:eastAsia="Times New Roman" w:cs="Times New Roman"/>
+        </w:rPr>
+        <w:t xml:space="preserve"> and p</w:t>
+      </w:r>
+      <w:r>
+        <w:rPr>
+          <w:rFonts w:eastAsia="Times New Roman" w:cs="Times New Roman"/>
+          <w:vertAlign w:val="superscript"/>
+        </w:rPr>
+        <w:t xml:space="preserve">m</w:t>
+      </w:r>
+      <w:r>
+        <w:rPr>
+          <w:rFonts w:eastAsia="Times New Roman" w:cs="Times New Roman"/>
+          <w:vertAlign w:val="subscript"/>
+        </w:rPr>
+        <w:t xml:space="preserve">k</w:t>
+      </w:r>
+      <w:r>
+        <w:rPr>
+          <w:rFonts w:eastAsia="Times New Roman" w:cs="Times New Roman"/>
+        </w:rPr>
+        <w:t xml:space="preserve">. Part (d) follows from Proposition 4(a), which makes W</w:t>
+      </w:r>
+      <w:r>
+        <w:rPr>
+          <w:rFonts w:eastAsia="Times New Roman" w:cs="Times New Roman"/>
+          <w:vertAlign w:val="subscript"/>
+        </w:rPr>
+        <w:t xml:space="preserve">k</w:t>
+      </w:r>
+      <w:r>
+        <w:rPr>
+          <w:rFonts w:eastAsia="Times New Roman" w:cs="Times New Roman"/>
+        </w:rPr>
+        <w:t xml:space="preserve"> strictly decreasing for p &gt; p*</w:t>
+      </w:r>
+      <w:r>
+        <w:rPr>
+          <w:rFonts w:eastAsia="Times New Roman" w:cs="Times New Roman"/>
+          <w:vertAlign w:val="subscript"/>
+        </w:rPr>
+        <w:t xml:space="preserve">k</w:t>
+      </w:r>
+      <w:r>
+        <w:rPr>
+          <w:rFonts w:eastAsia="Times New Roman" w:cs="Times New Roman"/>
+        </w:rPr>
+        <w:t xml:space="preserve">. ∎</w:t>
+      </w:r>
+    </w:p>
+    <w:p>
+      <w:pPr>
+        <w:pStyle w:val="Normal"/>
+        <w:jc w:val="both"/>
+        <w:rPr/>
+      </w:pPr>
+      <w:r>
+        <w:rPr>
+          <w:rFonts w:eastAsia="Times New Roman" w:cs="Times New Roman"/>
+        </w:rPr>
+        <w:t xml:space="preserve">Two features distinguish this problem from the planner’s. First, the monopoly price is the toll plus a markup, and the markup does not vanish in quiet phases. When a phase is nearly uncongested, the toll is close to zero but the provider still restricts the rate to keep the price high, so p</w:t>
+      </w:r>
+      <w:r>
+        <w:rPr>
+          <w:rFonts w:eastAsia="Times New Roman" w:cs="Times New Roman"/>
+          <w:vertAlign w:val="superscript"/>
+        </w:rPr>
+        <w:t xml:space="preserve">m</w:t>
+      </w:r>
+      <w:r>
+        <w:rPr>
+          <w:rFonts w:eastAsia="Times New Roman" w:cs="Times New Roman"/>
+          <w:vertAlign w:val="subscript"/>
+        </w:rPr>
+        <w:t xml:space="preserve">k</w:t>
+      </w:r>
+      <w:r>
+        <w:rPr>
+          <w:rFonts w:eastAsia="Times New Roman" w:cs="Times New Roman"/>
+        </w:rPr>
+        <w:t xml:space="preserve"> stays near (V − 1)/2, whereas the efficient price falls to zero. Monopoly prices therefore vary less across phases than efficient tolls, and a schedule built for revenue is flatter than one built for welfare. Second, the welfare effect of scheduling is ambiguous in theory. In the classical analysis of third-degree price discrimination with linear demands and constant marginal cost, a monopolist that serves all markets leaves total output unchanged, so discrimination lowers welfare (Schmalensee 1981, Varian 1985). Here the marginal cost of a request is the delay it causes, which rises with the load, and a single price is too high for quiet phases and too low for busy ones. Proposition 11(d) shows that moving a quiet phase from the flat price to its own monopoly price raises welfare in that phase; the effect in busy phases depends on how far the monopoly price overshoots the toll. Section 6.7 evaluates both effects on the calibration. The profit-maximizing case with competition is beyond our scope; Section 8 notes why we expect it to differ.</w:t>
       </w:r>
     </w:p>
     <w:p>
@@ -8854,26 +10859,14 @@
     </w:p>
     <w:p>
       <w:pPr>
-        <w:pStyle w:val="Heading1"/>
+        <w:pStyle w:val="Heading2"/>
         <w:rPr/>
       </w:pPr>
       <w:r>
         <w:rPr>
           <w:rFonts w:eastAsia="Times New Roman" w:cs="Times New Roman" w:ascii="Times New Roman" w:hAnsi="Times New Roman"/>
         </w:rPr>
-        <w:t>7. Implications for Research and Practice</w:t>
-      </w:r>
-    </w:p>
-    <w:p>
-      <w:pPr>
-        <w:pStyle w:val="Heading2"/>
-        <w:rPr/>
-      </w:pPr>
-      <w:r>
-        <w:rPr>
-          <w:rFonts w:eastAsia="Times New Roman" w:cs="Times New Roman" w:ascii="Times New Roman" w:hAnsi="Times New Roman"/>
-        </w:rPr>
-        <w:t>7.1 Implications for Research</w:t>
+        <w:t>6.7 A Profit-Maximizing Provider</w:t>
       </w:r>
     </w:p>
     <w:p>
@@ -8886,64 +10879,28 @@
         <w:rPr>
           <w:rFonts w:eastAsia="Times New Roman" w:cs="Times New Roman"/>
         </w:rPr>
-        <w:t>The classic IS theory of computing-service prices treats congestion as a stationary phenomenon and service as dedicated (Mendelson 1985, Dewan and Mendelson 1990). Our results show that the first simplification is harmless in some regimes and misleading in others, and that the dividing line is a ratio of time scales: the duration of a demand phase relative to the time the queue needs to adjust. This suggests that research on pricing AI services, and IT services more broadly, should report not only the level and dispersion of demand but also its temporal granularity. Two services with identical daily volumes and identical variance of demand can call for very different price structures if one fluctuates in bursts of seconds and the other in cycles of hours.</w:t>
-      </w:r>
-    </w:p>
-    <w:p>
-      <w:pPr>
-        <w:pStyle w:val="Normal"/>
-        <w:jc w:val="both"/>
-        <w:rPr/>
-      </w:pPr>
-      <w:r>
-        <w:rPr>
-          <w:rFonts w:eastAsia="Times New Roman" w:cs="Times New Roman"/>
-        </w:rPr>
-        <w:t>The second simplification matters because the externality that a theory prices must match the technology of service. Batched serving creates an externality that the dedicated-server model does not contain, and it changes both the level and the shape of efficient prices: quiet hours are no longer free, and schedules become flatter. The representation of the toll as overdispersion of occupancy, and the conditions under which it rises with load, carry over to any service technology that can be summarized by a completion rate that depends on the number of requests present, which makes them a portable tool for analytical IS research on shared digital infrastructure.</w:t>
-      </w:r>
-    </w:p>
-    <w:p>
-      <w:pPr>
-        <w:pStyle w:val="Normal"/>
-        <w:jc w:val="both"/>
-        <w:rPr/>
-      </w:pPr>
-      <w:r>
-        <w:rPr>
-          <w:rFonts w:eastAsia="Times New Roman" w:cs="Times New Roman"/>
-        </w:rPr>
-        <w:t>The results also bear on the IS literature that studies the menu and form of digital-service contracts. Much of that work asks which tiers or plans a provider should offer. Our analysis indicates that, for latency-sensitive services, a well-designed temporal schedule within a single tier can recover most of the welfare that hour-by-hour prices would deliver. Low-latency tiers, which providers serve with smaller batches, are a natural object for extending the model, since the slowdown externality is precisely what such tiers sell relief from.</w:t>
-      </w:r>
-    </w:p>
-    <w:p>
-      <w:pPr>
-        <w:pStyle w:val="Normal"/>
-        <w:jc w:val="both"/>
-        <w:rPr/>
-      </w:pPr>
-      <w:r>
-        <w:rPr>
-          <w:rFonts w:eastAsia="Times New Roman" w:cs="Times New Roman"/>
-        </w:rPr>
-        <w:t>Finally, the calibration illustrates a methodological point for analytical IS research. The choice of arrival model is not a technical detail. A Poisson model, an MMPP matched to second moments and a rate chain matched to the rate distribution can produce capacity requirements that differ by a factor of six on the same trace (Table 1). Analytical studies of AI services that rely on Poisson demand or on dedicated-server queues should, at a minimum, test their conclusions against trace replay on a model of the actual serving engine.</w:t>
-      </w:r>
-    </w:p>
-    <w:p>
-      <w:pPr>
-        <w:pStyle w:val="Heading2"/>
-        <w:rPr/>
-      </w:pPr>
-      <w:r>
-        <w:rPr>
-          <w:rFonts w:eastAsia="Times New Roman" w:cs="Times New Roman" w:ascii="Times New Roman" w:hAnsi="Times New Roman"/>
-        </w:rPr>
-        <w:t>7.2 Implications for Practice</w:t>
-      </w:r>
-    </w:p>
-    <w:p>
-      <w:pPr>
-        <w:pStyle w:val="Normal"/>
-        <w:jc w:val="both"/>
+        <w:t xml:space="preserve">We repeat the calibration of Section 6.2 for a provider that maximizes revenue pλ, with c</w:t>
+      </w:r>
+      <w:r>
+        <w:rPr>
+          <w:rFonts w:eastAsia="Times New Roman" w:cs="Times New Roman"/>
+          <w:vertAlign w:val="subscript"/>
+        </w:rPr>
+        <w:t xml:space="preserve">0</w:t>
+      </w:r>
+      <w:r>
+        <w:rPr>
+          <w:rFonts w:eastAsia="Times New Roman" w:cs="Times New Roman"/>
+        </w:rPr>
+        <w:t xml:space="preserve"> = 0, V = 20, unpriced demand 1.4 times capacity and the 24 hourly phases of the 2024 profile, under dedicated servers with c = 77 and under batching at the measured β/α with M = 1,024. Table 4 reports welfare as a percentage of first-best welfare and revenue as a percentage of the revenue of hourly revenue-maximizing prices.</w:t>
+      </w:r>
+    </w:p>
+    <w:p>
+      <w:pPr>
+        <w:pStyle w:val="Normal"/>
+        <w:keepNext/>
+        <w:spacing w:before="120" w:after="80"/>
+        <w:jc w:val="left"/>
         <w:rPr/>
       </w:pPr>
       <w:r>
@@ -8952,13 +10909,1160 @@
           <w:b/>
           <w:bCs/>
         </w:rPr>
-        <w:t>Capacity planning.</w:t>
-      </w:r>
-      <w:r>
-        <w:rPr>
-          <w:rFonts w:eastAsia="Times New Roman" w:cs="Times New Roman"/>
-        </w:rPr>
-        <w:t xml:space="preserve"> Mean utilization is not a sufficient statistic for sizing a cluster. Providers and platform teams should measure both the daily profile of their demand and the burstiness that remains once that profile is removed, using their own request logs, and they should measure how the step time of their serving engine grows with the batch size. The number of engines should then be validated by replaying those logs through a model of the engine rather than computed from an Erlang formula alone, and the delay target should cover the time requests spend in the batch, not only the time they wait to enter it. In our traces, the Poisson formula was too optimistic by between 23% and more than 80% under dedicated servers and by 7% to 81% under batching.</w:t>
+        <w:t xml:space="preserve">Table 4.</w:t>
+      </w:r>
+      <w:r>
+        <w:rPr>
+          <w:rFonts w:eastAsia="Times New Roman" w:cs="Times New Roman"/>
+        </w:rPr>
+        <w:t xml:space="preserve"> Welfare and Revenue under Alternative Pricing Rules (Azure 2024 Profile, V = 20, Unpriced Demand 1.4 Times Capacity, c0 = 0; % of First-Best Welfare and of Maximal Revenue)</w:t>
+      </w:r>
+    </w:p>
+    <w:tbl>
+      <w:tblPr>
+        <w:tblW w:w="9360" w:type="dxa"/>
+        <w:jc w:val="left"/>
+        <w:tblInd w:w="0" w:type="dxa"/>
+        <w:tblLayout w:type="fixed"/>
+        <w:tblCellMar>
+          <w:top w:w="60" w:type="dxa"/>
+          <w:left w:w="100" w:type="dxa"/>
+          <w:bottom w:w="60" w:type="dxa"/>
+          <w:right w:w="100" w:type="dxa"/>
+        </w:tblCellMar>
+      </w:tblPr>
+      <w:tblGrid>
+        <w:gridCol w:w="3360"/>
+        <w:gridCol w:w="1500"/>
+        <w:gridCol w:w="1500"/>
+        <w:gridCol w:w="1500"/>
+        <w:gridCol w:w="1500"/>
+      </w:tblGrid>
+      <w:tr>
+        <w:trPr>
+          <w:tblHeader w:val="true"/>
+        </w:trPr>
+        <w:tc>
+          <w:tcPr>
+            <w:tcW w:w="3360" w:type="dxa"/>
+            <w:tcBorders>
+              <w:top w:val="single" w:sz="4" w:space="0" w:color="808080"/>
+              <w:left w:val="single" w:sz="4" w:space="0" w:color="808080"/>
+              <w:bottom w:val="single" w:sz="4" w:space="0" w:color="808080"/>
+              <w:right w:val="single" w:sz="4" w:space="0" w:color="808080"/>
+            </w:tcBorders>
+            <w:shd w:color="auto" w:fill="E7E6E6" w:val="clear"/>
+          </w:tcPr>
+          <w:p>
+            <w:pPr>
+              <w:pStyle w:val="Normal"/>
+              <w:keepNext/>
+              <w:spacing w:before="0" w:after="0"/>
+              <w:jc w:val="left"/>
+              <w:rPr/>
+            </w:pPr>
+            <w:r>
+              <w:rPr>
+                <w:rFonts w:eastAsia="Times New Roman" w:cs="Times New Roman"/>
+                <w:b/>
+                <w:bCs/>
+                <w:sz w:val="20"/>
+                <w:szCs w:val="20"/>
+              </w:rPr>
+              <w:t xml:space="preserve">Pricing rule</w:t>
+            </w:r>
+          </w:p>
+        </w:tc>
+        <w:tc>
+          <w:tcPr>
+            <w:tcW w:w="1500" w:type="dxa"/>
+            <w:tcBorders>
+              <w:top w:val="single" w:sz="4" w:space="0" w:color="808080"/>
+              <w:left w:val="single" w:sz="4" w:space="0" w:color="808080"/>
+              <w:bottom w:val="single" w:sz="4" w:space="0" w:color="808080"/>
+              <w:right w:val="single" w:sz="4" w:space="0" w:color="808080"/>
+            </w:tcBorders>
+            <w:shd w:color="auto" w:fill="E7E6E6" w:val="clear"/>
+          </w:tcPr>
+          <w:p>
+            <w:pPr>
+              <w:pStyle w:val="Normal"/>
+              <w:keepNext/>
+              <w:spacing w:before="0" w:after="0"/>
+              <w:jc w:val="center"/>
+              <w:rPr/>
+            </w:pPr>
+            <w:r>
+              <w:rPr>
+                <w:rFonts w:eastAsia="Times New Roman" w:cs="Times New Roman"/>
+                <w:b/>
+                <w:bCs/>
+                <w:sz w:val="20"/>
+                <w:szCs w:val="20"/>
+              </w:rPr>
+              <w:t xml:space="preserve">Dedicated: welfare</w:t>
+            </w:r>
+          </w:p>
+        </w:tc>
+        <w:tc>
+          <w:tcPr>
+            <w:tcW w:w="1500" w:type="dxa"/>
+            <w:tcBorders>
+              <w:top w:val="single" w:sz="4" w:space="0" w:color="808080"/>
+              <w:left w:val="single" w:sz="4" w:space="0" w:color="808080"/>
+              <w:bottom w:val="single" w:sz="4" w:space="0" w:color="808080"/>
+              <w:right w:val="single" w:sz="4" w:space="0" w:color="808080"/>
+            </w:tcBorders>
+            <w:shd w:color="auto" w:fill="E7E6E6" w:val="clear"/>
+          </w:tcPr>
+          <w:p>
+            <w:pPr>
+              <w:pStyle w:val="Normal"/>
+              <w:keepNext/>
+              <w:spacing w:before="0" w:after="0"/>
+              <w:jc w:val="center"/>
+              <w:rPr/>
+            </w:pPr>
+            <w:r>
+              <w:rPr>
+                <w:rFonts w:eastAsia="Times New Roman" w:cs="Times New Roman"/>
+                <w:b/>
+                <w:bCs/>
+                <w:sz w:val="20"/>
+                <w:szCs w:val="20"/>
+              </w:rPr>
+              <w:t xml:space="preserve">Dedicated: revenue</w:t>
+            </w:r>
+          </w:p>
+        </w:tc>
+        <w:tc>
+          <w:tcPr>
+            <w:tcW w:w="1500" w:type="dxa"/>
+            <w:tcBorders>
+              <w:top w:val="single" w:sz="4" w:space="0" w:color="808080"/>
+              <w:left w:val="single" w:sz="4" w:space="0" w:color="808080"/>
+              <w:bottom w:val="single" w:sz="4" w:space="0" w:color="808080"/>
+              <w:right w:val="single" w:sz="4" w:space="0" w:color="808080"/>
+            </w:tcBorders>
+            <w:shd w:color="auto" w:fill="E7E6E6" w:val="clear"/>
+          </w:tcPr>
+          <w:p>
+            <w:pPr>
+              <w:pStyle w:val="Normal"/>
+              <w:keepNext/>
+              <w:spacing w:before="0" w:after="0"/>
+              <w:jc w:val="center"/>
+              <w:rPr/>
+            </w:pPr>
+            <w:r>
+              <w:rPr>
+                <w:rFonts w:eastAsia="Times New Roman" w:cs="Times New Roman"/>
+                <w:b/>
+                <w:bCs/>
+                <w:sz w:val="20"/>
+                <w:szCs w:val="20"/>
+              </w:rPr>
+              <w:t xml:space="preserve">Batched: welfare</w:t>
+            </w:r>
+          </w:p>
+        </w:tc>
+        <w:tc>
+          <w:tcPr>
+            <w:tcW w:w="1500" w:type="dxa"/>
+            <w:tcBorders>
+              <w:top w:val="single" w:sz="4" w:space="0" w:color="808080"/>
+              <w:left w:val="single" w:sz="4" w:space="0" w:color="808080"/>
+              <w:bottom w:val="single" w:sz="4" w:space="0" w:color="808080"/>
+              <w:right w:val="single" w:sz="4" w:space="0" w:color="808080"/>
+            </w:tcBorders>
+            <w:shd w:color="auto" w:fill="E7E6E6" w:val="clear"/>
+          </w:tcPr>
+          <w:p>
+            <w:pPr>
+              <w:pStyle w:val="Normal"/>
+              <w:keepNext/>
+              <w:spacing w:before="0" w:after="0"/>
+              <w:jc w:val="center"/>
+              <w:rPr/>
+            </w:pPr>
+            <w:r>
+              <w:rPr>
+                <w:rFonts w:eastAsia="Times New Roman" w:cs="Times New Roman"/>
+                <w:b/>
+                <w:bCs/>
+                <w:sz w:val="20"/>
+                <w:szCs w:val="20"/>
+              </w:rPr>
+              <w:t xml:space="preserve">Batched: revenue</w:t>
+            </w:r>
+          </w:p>
+        </w:tc>
+      </w:tr>
+      <w:tr>
+        <w:tc>
+          <w:tcPr>
+            <w:tcW w:w="3360" w:type="dxa"/>
+            <w:tcBorders>
+              <w:top w:val="single" w:sz="4" w:space="0" w:color="808080"/>
+              <w:left w:val="single" w:sz="4" w:space="0" w:color="808080"/>
+              <w:bottom w:val="single" w:sz="4" w:space="0" w:color="808080"/>
+              <w:right w:val="single" w:sz="4" w:space="0" w:color="808080"/>
+            </w:tcBorders>
+          </w:tcPr>
+          <w:p>
+            <w:pPr>
+              <w:pStyle w:val="Normal"/>
+              <w:keepNext/>
+              <w:spacing w:before="0" w:after="0"/>
+              <w:jc w:val="left"/>
+              <w:rPr/>
+            </w:pPr>
+            <w:r>
+              <w:rPr>
+                <w:rFonts w:eastAsia="Times New Roman" w:cs="Times New Roman"/>
+                <w:sz w:val="20"/>
+                <w:szCs w:val="20"/>
+              </w:rPr>
+              <w:t xml:space="preserve">No price</w:t>
+            </w:r>
+          </w:p>
+        </w:tc>
+        <w:tc>
+          <w:tcPr>
+            <w:tcW w:w="1500" w:type="dxa"/>
+            <w:tcBorders>
+              <w:top w:val="single" w:sz="4" w:space="0" w:color="808080"/>
+              <w:left w:val="single" w:sz="4" w:space="0" w:color="808080"/>
+              <w:bottom w:val="single" w:sz="4" w:space="0" w:color="808080"/>
+              <w:right w:val="single" w:sz="4" w:space="0" w:color="808080"/>
+            </w:tcBorders>
+          </w:tcPr>
+          <w:p>
+            <w:pPr>
+              <w:pStyle w:val="Normal"/>
+              <w:keepNext/>
+              <w:spacing w:before="0" w:after="0"/>
+              <w:jc w:val="center"/>
+              <w:rPr/>
+            </w:pPr>
+            <w:r>
+              <w:rPr>
+                <w:rFonts w:eastAsia="Times New Roman" w:cs="Times New Roman"/>
+                <w:sz w:val="20"/>
+                <w:szCs w:val="20"/>
+              </w:rPr>
+              <w:t xml:space="preserve">55.9</w:t>
+            </w:r>
+          </w:p>
+        </w:tc>
+        <w:tc>
+          <w:tcPr>
+            <w:tcW w:w="1500" w:type="dxa"/>
+            <w:tcBorders>
+              <w:top w:val="single" w:sz="4" w:space="0" w:color="808080"/>
+              <w:left w:val="single" w:sz="4" w:space="0" w:color="808080"/>
+              <w:bottom w:val="single" w:sz="4" w:space="0" w:color="808080"/>
+              <w:right w:val="single" w:sz="4" w:space="0" w:color="808080"/>
+            </w:tcBorders>
+          </w:tcPr>
+          <w:p>
+            <w:pPr>
+              <w:pStyle w:val="Normal"/>
+              <w:keepNext/>
+              <w:spacing w:before="0" w:after="0"/>
+              <w:jc w:val="center"/>
+              <w:rPr/>
+            </w:pPr>
+            <w:r>
+              <w:rPr>
+                <w:rFonts w:eastAsia="Times New Roman" w:cs="Times New Roman"/>
+                <w:sz w:val="20"/>
+                <w:szCs w:val="20"/>
+              </w:rPr>
+              <w:t xml:space="preserve">0.0</w:t>
+            </w:r>
+          </w:p>
+        </w:tc>
+        <w:tc>
+          <w:tcPr>
+            <w:tcW w:w="1500" w:type="dxa"/>
+            <w:tcBorders>
+              <w:top w:val="single" w:sz="4" w:space="0" w:color="808080"/>
+              <w:left w:val="single" w:sz="4" w:space="0" w:color="808080"/>
+              <w:bottom w:val="single" w:sz="4" w:space="0" w:color="808080"/>
+              <w:right w:val="single" w:sz="4" w:space="0" w:color="808080"/>
+            </w:tcBorders>
+          </w:tcPr>
+          <w:p>
+            <w:pPr>
+              <w:pStyle w:val="Normal"/>
+              <w:keepNext/>
+              <w:spacing w:before="0" w:after="0"/>
+              <w:jc w:val="center"/>
+              <w:rPr/>
+            </w:pPr>
+            <w:r>
+              <w:rPr>
+                <w:rFonts w:eastAsia="Times New Roman" w:cs="Times New Roman"/>
+                <w:sz w:val="20"/>
+                <w:szCs w:val="20"/>
+              </w:rPr>
+              <w:t xml:space="preserve">63.3</w:t>
+            </w:r>
+          </w:p>
+        </w:tc>
+        <w:tc>
+          <w:tcPr>
+            <w:tcW w:w="1500" w:type="dxa"/>
+            <w:tcBorders>
+              <w:top w:val="single" w:sz="4" w:space="0" w:color="808080"/>
+              <w:left w:val="single" w:sz="4" w:space="0" w:color="808080"/>
+              <w:bottom w:val="single" w:sz="4" w:space="0" w:color="808080"/>
+              <w:right w:val="single" w:sz="4" w:space="0" w:color="808080"/>
+            </w:tcBorders>
+          </w:tcPr>
+          <w:p>
+            <w:pPr>
+              <w:pStyle w:val="Normal"/>
+              <w:keepNext/>
+              <w:spacing w:before="0" w:after="0"/>
+              <w:jc w:val="center"/>
+              <w:rPr/>
+            </w:pPr>
+            <w:r>
+              <w:rPr>
+                <w:rFonts w:eastAsia="Times New Roman" w:cs="Times New Roman"/>
+                <w:sz w:val="20"/>
+                <w:szCs w:val="20"/>
+              </w:rPr>
+              <w:t xml:space="preserve">0.0</w:t>
+            </w:r>
+          </w:p>
+        </w:tc>
+      </w:tr>
+      <w:tr>
+        <w:tc>
+          <w:tcPr>
+            <w:tcW w:w="3360" w:type="dxa"/>
+            <w:tcBorders>
+              <w:top w:val="single" w:sz="4" w:space="0" w:color="808080"/>
+              <w:left w:val="single" w:sz="4" w:space="0" w:color="808080"/>
+              <w:bottom w:val="single" w:sz="4" w:space="0" w:color="808080"/>
+              <w:right w:val="single" w:sz="4" w:space="0" w:color="808080"/>
+            </w:tcBorders>
+          </w:tcPr>
+          <w:p>
+            <w:pPr>
+              <w:pStyle w:val="Normal"/>
+              <w:keepNext/>
+              <w:spacing w:before="0" w:after="0"/>
+              <w:jc w:val="left"/>
+              <w:rPr/>
+            </w:pPr>
+            <w:r>
+              <w:rPr>
+                <w:rFonts w:eastAsia="Times New Roman" w:cs="Times New Roman"/>
+                <w:sz w:val="20"/>
+                <w:szCs w:val="20"/>
+              </w:rPr>
+              <w:t xml:space="preserve">Best flat price (welfare)</w:t>
+            </w:r>
+          </w:p>
+        </w:tc>
+        <w:tc>
+          <w:tcPr>
+            <w:tcW w:w="1500" w:type="dxa"/>
+            <w:tcBorders>
+              <w:top w:val="single" w:sz="4" w:space="0" w:color="808080"/>
+              <w:left w:val="single" w:sz="4" w:space="0" w:color="808080"/>
+              <w:bottom w:val="single" w:sz="4" w:space="0" w:color="808080"/>
+              <w:right w:val="single" w:sz="4" w:space="0" w:color="808080"/>
+            </w:tcBorders>
+          </w:tcPr>
+          <w:p>
+            <w:pPr>
+              <w:pStyle w:val="Normal"/>
+              <w:keepNext/>
+              <w:spacing w:before="0" w:after="0"/>
+              <w:jc w:val="center"/>
+              <w:rPr/>
+            </w:pPr>
+            <w:r>
+              <w:rPr>
+                <w:rFonts w:eastAsia="Times New Roman" w:cs="Times New Roman"/>
+                <w:sz w:val="20"/>
+                <w:szCs w:val="20"/>
+              </w:rPr>
+              <w:t xml:space="preserve">85.3</w:t>
+            </w:r>
+          </w:p>
+        </w:tc>
+        <w:tc>
+          <w:tcPr>
+            <w:tcW w:w="1500" w:type="dxa"/>
+            <w:tcBorders>
+              <w:top w:val="single" w:sz="4" w:space="0" w:color="808080"/>
+              <w:left w:val="single" w:sz="4" w:space="0" w:color="808080"/>
+              <w:bottom w:val="single" w:sz="4" w:space="0" w:color="808080"/>
+              <w:right w:val="single" w:sz="4" w:space="0" w:color="808080"/>
+            </w:tcBorders>
+          </w:tcPr>
+          <w:p>
+            <w:pPr>
+              <w:pStyle w:val="Normal"/>
+              <w:keepNext/>
+              <w:spacing w:before="0" w:after="0"/>
+              <w:jc w:val="center"/>
+              <w:rPr/>
+            </w:pPr>
+            <w:r>
+              <w:rPr>
+                <w:rFonts w:eastAsia="Times New Roman" w:cs="Times New Roman"/>
+                <w:sz w:val="20"/>
+                <w:szCs w:val="20"/>
+              </w:rPr>
+              <w:t xml:space="preserve">92.9</w:t>
+            </w:r>
+          </w:p>
+        </w:tc>
+        <w:tc>
+          <w:tcPr>
+            <w:tcW w:w="1500" w:type="dxa"/>
+            <w:tcBorders>
+              <w:top w:val="single" w:sz="4" w:space="0" w:color="808080"/>
+              <w:left w:val="single" w:sz="4" w:space="0" w:color="808080"/>
+              <w:bottom w:val="single" w:sz="4" w:space="0" w:color="808080"/>
+              <w:right w:val="single" w:sz="4" w:space="0" w:color="808080"/>
+            </w:tcBorders>
+          </w:tcPr>
+          <w:p>
+            <w:pPr>
+              <w:pStyle w:val="Normal"/>
+              <w:keepNext/>
+              <w:spacing w:before="0" w:after="0"/>
+              <w:jc w:val="center"/>
+              <w:rPr/>
+            </w:pPr>
+            <w:r>
+              <w:rPr>
+                <w:rFonts w:eastAsia="Times New Roman" w:cs="Times New Roman"/>
+                <w:sz w:val="20"/>
+                <w:szCs w:val="20"/>
+              </w:rPr>
+              <w:t xml:space="preserve">93.4</w:t>
+            </w:r>
+          </w:p>
+        </w:tc>
+        <w:tc>
+          <w:tcPr>
+            <w:tcW w:w="1500" w:type="dxa"/>
+            <w:tcBorders>
+              <w:top w:val="single" w:sz="4" w:space="0" w:color="808080"/>
+              <w:left w:val="single" w:sz="4" w:space="0" w:color="808080"/>
+              <w:bottom w:val="single" w:sz="4" w:space="0" w:color="808080"/>
+              <w:right w:val="single" w:sz="4" w:space="0" w:color="808080"/>
+            </w:tcBorders>
+          </w:tcPr>
+          <w:p>
+            <w:pPr>
+              <w:pStyle w:val="Normal"/>
+              <w:keepNext/>
+              <w:spacing w:before="0" w:after="0"/>
+              <w:jc w:val="center"/>
+              <w:rPr/>
+            </w:pPr>
+            <w:r>
+              <w:rPr>
+                <w:rFonts w:eastAsia="Times New Roman" w:cs="Times New Roman"/>
+                <w:sz w:val="20"/>
+                <w:szCs w:val="20"/>
+              </w:rPr>
+              <w:t xml:space="preserve">90.2</w:t>
+            </w:r>
+          </w:p>
+        </w:tc>
+      </w:tr>
+      <w:tr>
+        <w:tc>
+          <w:tcPr>
+            <w:tcW w:w="3360" w:type="dxa"/>
+            <w:tcBorders>
+              <w:top w:val="single" w:sz="4" w:space="0" w:color="808080"/>
+              <w:left w:val="single" w:sz="4" w:space="0" w:color="808080"/>
+              <w:bottom w:val="single" w:sz="4" w:space="0" w:color="808080"/>
+              <w:right w:val="single" w:sz="4" w:space="0" w:color="808080"/>
+            </w:tcBorders>
+          </w:tcPr>
+          <w:p>
+            <w:pPr>
+              <w:pStyle w:val="Normal"/>
+              <w:keepNext/>
+              <w:spacing w:before="0" w:after="0"/>
+              <w:jc w:val="left"/>
+              <w:rPr/>
+            </w:pPr>
+            <w:r>
+              <w:rPr>
+                <w:rFonts w:eastAsia="Times New Roman" w:cs="Times New Roman"/>
+                <w:sz w:val="20"/>
+                <w:szCs w:val="20"/>
+              </w:rPr>
+              <w:t xml:space="preserve">Hourly prices (first best)</w:t>
+            </w:r>
+          </w:p>
+        </w:tc>
+        <w:tc>
+          <w:tcPr>
+            <w:tcW w:w="1500" w:type="dxa"/>
+            <w:tcBorders>
+              <w:top w:val="single" w:sz="4" w:space="0" w:color="808080"/>
+              <w:left w:val="single" w:sz="4" w:space="0" w:color="808080"/>
+              <w:bottom w:val="single" w:sz="4" w:space="0" w:color="808080"/>
+              <w:right w:val="single" w:sz="4" w:space="0" w:color="808080"/>
+            </w:tcBorders>
+          </w:tcPr>
+          <w:p>
+            <w:pPr>
+              <w:pStyle w:val="Normal"/>
+              <w:keepNext/>
+              <w:spacing w:before="0" w:after="0"/>
+              <w:jc w:val="center"/>
+              <w:rPr/>
+            </w:pPr>
+            <w:r>
+              <w:rPr>
+                <w:rFonts w:eastAsia="Times New Roman" w:cs="Times New Roman"/>
+                <w:sz w:val="20"/>
+                <w:szCs w:val="20"/>
+              </w:rPr>
+              <w:t xml:space="preserve">100.0</w:t>
+            </w:r>
+          </w:p>
+        </w:tc>
+        <w:tc>
+          <w:tcPr>
+            <w:tcW w:w="1500" w:type="dxa"/>
+            <w:tcBorders>
+              <w:top w:val="single" w:sz="4" w:space="0" w:color="808080"/>
+              <w:left w:val="single" w:sz="4" w:space="0" w:color="808080"/>
+              <w:bottom w:val="single" w:sz="4" w:space="0" w:color="808080"/>
+              <w:right w:val="single" w:sz="4" w:space="0" w:color="808080"/>
+            </w:tcBorders>
+          </w:tcPr>
+          <w:p>
+            <w:pPr>
+              <w:pStyle w:val="Normal"/>
+              <w:keepNext/>
+              <w:spacing w:before="0" w:after="0"/>
+              <w:jc w:val="center"/>
+              <w:rPr/>
+            </w:pPr>
+            <w:r>
+              <w:rPr>
+                <w:rFonts w:eastAsia="Times New Roman" w:cs="Times New Roman"/>
+                <w:sz w:val="20"/>
+                <w:szCs w:val="20"/>
+              </w:rPr>
+              <w:t xml:space="preserve">73.7</w:t>
+            </w:r>
+          </w:p>
+        </w:tc>
+        <w:tc>
+          <w:tcPr>
+            <w:tcW w:w="1500" w:type="dxa"/>
+            <w:tcBorders>
+              <w:top w:val="single" w:sz="4" w:space="0" w:color="808080"/>
+              <w:left w:val="single" w:sz="4" w:space="0" w:color="808080"/>
+              <w:bottom w:val="single" w:sz="4" w:space="0" w:color="808080"/>
+              <w:right w:val="single" w:sz="4" w:space="0" w:color="808080"/>
+            </w:tcBorders>
+          </w:tcPr>
+          <w:p>
+            <w:pPr>
+              <w:pStyle w:val="Normal"/>
+              <w:keepNext/>
+              <w:spacing w:before="0" w:after="0"/>
+              <w:jc w:val="center"/>
+              <w:rPr/>
+            </w:pPr>
+            <w:r>
+              <w:rPr>
+                <w:rFonts w:eastAsia="Times New Roman" w:cs="Times New Roman"/>
+                <w:sz w:val="20"/>
+                <w:szCs w:val="20"/>
+              </w:rPr>
+              <w:t xml:space="preserve">100.0</w:t>
+            </w:r>
+          </w:p>
+        </w:tc>
+        <w:tc>
+          <w:tcPr>
+            <w:tcW w:w="1500" w:type="dxa"/>
+            <w:tcBorders>
+              <w:top w:val="single" w:sz="4" w:space="0" w:color="808080"/>
+              <w:left w:val="single" w:sz="4" w:space="0" w:color="808080"/>
+              <w:bottom w:val="single" w:sz="4" w:space="0" w:color="808080"/>
+              <w:right w:val="single" w:sz="4" w:space="0" w:color="808080"/>
+            </w:tcBorders>
+          </w:tcPr>
+          <w:p>
+            <w:pPr>
+              <w:pStyle w:val="Normal"/>
+              <w:keepNext/>
+              <w:spacing w:before="0" w:after="0"/>
+              <w:jc w:val="center"/>
+              <w:rPr/>
+            </w:pPr>
+            <w:r>
+              <w:rPr>
+                <w:rFonts w:eastAsia="Times New Roman" w:cs="Times New Roman"/>
+                <w:sz w:val="20"/>
+                <w:szCs w:val="20"/>
+              </w:rPr>
+              <w:t xml:space="preserve">79.3</w:t>
+            </w:r>
+          </w:p>
+        </w:tc>
+      </w:tr>
+      <w:tr>
+        <w:tc>
+          <w:tcPr>
+            <w:tcW w:w="3360" w:type="dxa"/>
+            <w:tcBorders>
+              <w:top w:val="single" w:sz="4" w:space="0" w:color="808080"/>
+              <w:left w:val="single" w:sz="4" w:space="0" w:color="808080"/>
+              <w:bottom w:val="single" w:sz="4" w:space="0" w:color="808080"/>
+              <w:right w:val="single" w:sz="4" w:space="0" w:color="808080"/>
+            </w:tcBorders>
+          </w:tcPr>
+          <w:p>
+            <w:pPr>
+              <w:pStyle w:val="Normal"/>
+              <w:keepNext/>
+              <w:spacing w:before="0" w:after="0"/>
+              <w:jc w:val="left"/>
+              <w:rPr/>
+            </w:pPr>
+            <w:r>
+              <w:rPr>
+                <w:rFonts w:eastAsia="Times New Roman" w:cs="Times New Roman"/>
+                <w:sz w:val="20"/>
+                <w:szCs w:val="20"/>
+              </w:rPr>
+              <w:t xml:space="preserve">Best flat price (revenue)</w:t>
+            </w:r>
+          </w:p>
+        </w:tc>
+        <w:tc>
+          <w:tcPr>
+            <w:tcW w:w="1500" w:type="dxa"/>
+            <w:tcBorders>
+              <w:top w:val="single" w:sz="4" w:space="0" w:color="808080"/>
+              <w:left w:val="single" w:sz="4" w:space="0" w:color="808080"/>
+              <w:bottom w:val="single" w:sz="4" w:space="0" w:color="808080"/>
+              <w:right w:val="single" w:sz="4" w:space="0" w:color="808080"/>
+            </w:tcBorders>
+          </w:tcPr>
+          <w:p>
+            <w:pPr>
+              <w:pStyle w:val="Normal"/>
+              <w:keepNext/>
+              <w:spacing w:before="0" w:after="0"/>
+              <w:jc w:val="center"/>
+              <w:rPr/>
+            </w:pPr>
+            <w:r>
+              <w:rPr>
+                <w:rFonts w:eastAsia="Times New Roman" w:cs="Times New Roman"/>
+                <w:sz w:val="20"/>
+                <w:szCs w:val="20"/>
+              </w:rPr>
+              <w:t xml:space="preserve">82.5</w:t>
+            </w:r>
+          </w:p>
+        </w:tc>
+        <w:tc>
+          <w:tcPr>
+            <w:tcW w:w="1500" w:type="dxa"/>
+            <w:tcBorders>
+              <w:top w:val="single" w:sz="4" w:space="0" w:color="808080"/>
+              <w:left w:val="single" w:sz="4" w:space="0" w:color="808080"/>
+              <w:bottom w:val="single" w:sz="4" w:space="0" w:color="808080"/>
+              <w:right w:val="single" w:sz="4" w:space="0" w:color="808080"/>
+            </w:tcBorders>
+          </w:tcPr>
+          <w:p>
+            <w:pPr>
+              <w:pStyle w:val="Normal"/>
+              <w:keepNext/>
+              <w:spacing w:before="0" w:after="0"/>
+              <w:jc w:val="center"/>
+              <w:rPr/>
+            </w:pPr>
+            <w:r>
+              <w:rPr>
+                <w:rFonts w:eastAsia="Times New Roman" w:cs="Times New Roman"/>
+                <w:sz w:val="20"/>
+                <w:szCs w:val="20"/>
+              </w:rPr>
+              <w:t xml:space="preserve">96.9</w:t>
+            </w:r>
+          </w:p>
+        </w:tc>
+        <w:tc>
+          <w:tcPr>
+            <w:tcW w:w="1500" w:type="dxa"/>
+            <w:tcBorders>
+              <w:top w:val="single" w:sz="4" w:space="0" w:color="808080"/>
+              <w:left w:val="single" w:sz="4" w:space="0" w:color="808080"/>
+              <w:bottom w:val="single" w:sz="4" w:space="0" w:color="808080"/>
+              <w:right w:val="single" w:sz="4" w:space="0" w:color="808080"/>
+            </w:tcBorders>
+          </w:tcPr>
+          <w:p>
+            <w:pPr>
+              <w:pStyle w:val="Normal"/>
+              <w:keepNext/>
+              <w:spacing w:before="0" w:after="0"/>
+              <w:jc w:val="center"/>
+              <w:rPr/>
+            </w:pPr>
+            <w:r>
+              <w:rPr>
+                <w:rFonts w:eastAsia="Times New Roman" w:cs="Times New Roman"/>
+                <w:sz w:val="20"/>
+                <w:szCs w:val="20"/>
+              </w:rPr>
+              <w:t xml:space="preserve">88.1</w:t>
+            </w:r>
+          </w:p>
+        </w:tc>
+        <w:tc>
+          <w:tcPr>
+            <w:tcW w:w="1500" w:type="dxa"/>
+            <w:tcBorders>
+              <w:top w:val="single" w:sz="4" w:space="0" w:color="808080"/>
+              <w:left w:val="single" w:sz="4" w:space="0" w:color="808080"/>
+              <w:bottom w:val="single" w:sz="4" w:space="0" w:color="808080"/>
+              <w:right w:val="single" w:sz="4" w:space="0" w:color="808080"/>
+            </w:tcBorders>
+          </w:tcPr>
+          <w:p>
+            <w:pPr>
+              <w:pStyle w:val="Normal"/>
+              <w:keepNext/>
+              <w:spacing w:before="0" w:after="0"/>
+              <w:jc w:val="center"/>
+              <w:rPr/>
+            </w:pPr>
+            <w:r>
+              <w:rPr>
+                <w:rFonts w:eastAsia="Times New Roman" w:cs="Times New Roman"/>
+                <w:sz w:val="20"/>
+                <w:szCs w:val="20"/>
+              </w:rPr>
+              <w:t xml:space="preserve">99.1</w:t>
+            </w:r>
+          </w:p>
+        </w:tc>
+      </w:tr>
+      <w:tr>
+        <w:tc>
+          <w:tcPr>
+            <w:tcW w:w="3360" w:type="dxa"/>
+            <w:tcBorders>
+              <w:top w:val="single" w:sz="4" w:space="0" w:color="808080"/>
+              <w:left w:val="single" w:sz="4" w:space="0" w:color="808080"/>
+              <w:bottom w:val="single" w:sz="4" w:space="0" w:color="808080"/>
+              <w:right w:val="single" w:sz="4" w:space="0" w:color="808080"/>
+            </w:tcBorders>
+          </w:tcPr>
+          <w:p>
+            <w:pPr>
+              <w:pStyle w:val="Normal"/>
+              <w:keepNext/>
+              <w:spacing w:before="0" w:after="0"/>
+              <w:jc w:val="left"/>
+              <w:rPr/>
+            </w:pPr>
+            <w:r>
+              <w:rPr>
+                <w:rFonts w:eastAsia="Times New Roman" w:cs="Times New Roman"/>
+                <w:sz w:val="20"/>
+                <w:szCs w:val="20"/>
+              </w:rPr>
+              <w:t xml:space="preserve">Best two-level schedule (revenue)</w:t>
+            </w:r>
+          </w:p>
+        </w:tc>
+        <w:tc>
+          <w:tcPr>
+            <w:tcW w:w="1500" w:type="dxa"/>
+            <w:tcBorders>
+              <w:top w:val="single" w:sz="4" w:space="0" w:color="808080"/>
+              <w:left w:val="single" w:sz="4" w:space="0" w:color="808080"/>
+              <w:bottom w:val="single" w:sz="4" w:space="0" w:color="808080"/>
+              <w:right w:val="single" w:sz="4" w:space="0" w:color="808080"/>
+            </w:tcBorders>
+          </w:tcPr>
+          <w:p>
+            <w:pPr>
+              <w:pStyle w:val="Normal"/>
+              <w:keepNext/>
+              <w:spacing w:before="0" w:after="0"/>
+              <w:jc w:val="center"/>
+              <w:rPr/>
+            </w:pPr>
+            <w:r>
+              <w:rPr>
+                <w:rFonts w:eastAsia="Times New Roman" w:cs="Times New Roman"/>
+                <w:sz w:val="20"/>
+                <w:szCs w:val="20"/>
+              </w:rPr>
+              <w:t xml:space="preserve">86.5</w:t>
+            </w:r>
+          </w:p>
+        </w:tc>
+        <w:tc>
+          <w:tcPr>
+            <w:tcW w:w="1500" w:type="dxa"/>
+            <w:tcBorders>
+              <w:top w:val="single" w:sz="4" w:space="0" w:color="808080"/>
+              <w:left w:val="single" w:sz="4" w:space="0" w:color="808080"/>
+              <w:bottom w:val="single" w:sz="4" w:space="0" w:color="808080"/>
+              <w:right w:val="single" w:sz="4" w:space="0" w:color="808080"/>
+            </w:tcBorders>
+          </w:tcPr>
+          <w:p>
+            <w:pPr>
+              <w:pStyle w:val="Normal"/>
+              <w:keepNext/>
+              <w:spacing w:before="0" w:after="0"/>
+              <w:jc w:val="center"/>
+              <w:rPr/>
+            </w:pPr>
+            <w:r>
+              <w:rPr>
+                <w:rFonts w:eastAsia="Times New Roman" w:cs="Times New Roman"/>
+                <w:sz w:val="20"/>
+                <w:szCs w:val="20"/>
+              </w:rPr>
+              <w:t xml:space="preserve">99.2</w:t>
+            </w:r>
+          </w:p>
+        </w:tc>
+        <w:tc>
+          <w:tcPr>
+            <w:tcW w:w="1500" w:type="dxa"/>
+            <w:tcBorders>
+              <w:top w:val="single" w:sz="4" w:space="0" w:color="808080"/>
+              <w:left w:val="single" w:sz="4" w:space="0" w:color="808080"/>
+              <w:bottom w:val="single" w:sz="4" w:space="0" w:color="808080"/>
+              <w:right w:val="single" w:sz="4" w:space="0" w:color="808080"/>
+            </w:tcBorders>
+          </w:tcPr>
+          <w:p>
+            <w:pPr>
+              <w:pStyle w:val="Normal"/>
+              <w:keepNext/>
+              <w:spacing w:before="0" w:after="0"/>
+              <w:jc w:val="center"/>
+              <w:rPr/>
+            </w:pPr>
+            <w:r>
+              <w:rPr>
+                <w:rFonts w:eastAsia="Times New Roman" w:cs="Times New Roman"/>
+                <w:sz w:val="20"/>
+                <w:szCs w:val="20"/>
+              </w:rPr>
+              <w:t xml:space="preserve">90.1</w:t>
+            </w:r>
+          </w:p>
+        </w:tc>
+        <w:tc>
+          <w:tcPr>
+            <w:tcW w:w="1500" w:type="dxa"/>
+            <w:tcBorders>
+              <w:top w:val="single" w:sz="4" w:space="0" w:color="808080"/>
+              <w:left w:val="single" w:sz="4" w:space="0" w:color="808080"/>
+              <w:bottom w:val="single" w:sz="4" w:space="0" w:color="808080"/>
+              <w:right w:val="single" w:sz="4" w:space="0" w:color="808080"/>
+            </w:tcBorders>
+          </w:tcPr>
+          <w:p>
+            <w:pPr>
+              <w:pStyle w:val="Normal"/>
+              <w:keepNext/>
+              <w:spacing w:before="0" w:after="0"/>
+              <w:jc w:val="center"/>
+              <w:rPr/>
+            </w:pPr>
+            <w:r>
+              <w:rPr>
+                <w:rFonts w:eastAsia="Times New Roman" w:cs="Times New Roman"/>
+                <w:sz w:val="20"/>
+                <w:szCs w:val="20"/>
+              </w:rPr>
+              <w:t xml:space="preserve">99.9</w:t>
+            </w:r>
+          </w:p>
+        </w:tc>
+      </w:tr>
+      <w:tr>
+        <w:tc>
+          <w:tcPr>
+            <w:tcW w:w="3360" w:type="dxa"/>
+            <w:tcBorders>
+              <w:top w:val="single" w:sz="4" w:space="0" w:color="808080"/>
+              <w:left w:val="single" w:sz="4" w:space="0" w:color="808080"/>
+              <w:bottom w:val="single" w:sz="4" w:space="0" w:color="808080"/>
+              <w:right w:val="single" w:sz="4" w:space="0" w:color="808080"/>
+            </w:tcBorders>
+          </w:tcPr>
+          <w:p>
+            <w:pPr>
+              <w:pStyle w:val="Normal"/>
+              <w:keepNext/>
+              <w:spacing w:before="0" w:after="0"/>
+              <w:jc w:val="left"/>
+              <w:rPr/>
+            </w:pPr>
+            <w:r>
+              <w:rPr>
+                <w:rFonts w:eastAsia="Times New Roman" w:cs="Times New Roman"/>
+                <w:sz w:val="20"/>
+                <w:szCs w:val="20"/>
+              </w:rPr>
+              <w:t xml:space="preserve">Hourly prices (revenue)</w:t>
+            </w:r>
+          </w:p>
+        </w:tc>
+        <w:tc>
+          <w:tcPr>
+            <w:tcW w:w="1500" w:type="dxa"/>
+            <w:tcBorders>
+              <w:top w:val="single" w:sz="4" w:space="0" w:color="808080"/>
+              <w:left w:val="single" w:sz="4" w:space="0" w:color="808080"/>
+              <w:bottom w:val="single" w:sz="4" w:space="0" w:color="808080"/>
+              <w:right w:val="single" w:sz="4" w:space="0" w:color="808080"/>
+            </w:tcBorders>
+          </w:tcPr>
+          <w:p>
+            <w:pPr>
+              <w:pStyle w:val="Normal"/>
+              <w:keepNext/>
+              <w:spacing w:before="0" w:after="0"/>
+              <w:jc w:val="center"/>
+              <w:rPr/>
+            </w:pPr>
+            <w:r>
+              <w:rPr>
+                <w:rFonts w:eastAsia="Times New Roman" w:cs="Times New Roman"/>
+                <w:sz w:val="20"/>
+                <w:szCs w:val="20"/>
+              </w:rPr>
+              <w:t xml:space="preserve">89.1</w:t>
+            </w:r>
+          </w:p>
+        </w:tc>
+        <w:tc>
+          <w:tcPr>
+            <w:tcW w:w="1500" w:type="dxa"/>
+            <w:tcBorders>
+              <w:top w:val="single" w:sz="4" w:space="0" w:color="808080"/>
+              <w:left w:val="single" w:sz="4" w:space="0" w:color="808080"/>
+              <w:bottom w:val="single" w:sz="4" w:space="0" w:color="808080"/>
+              <w:right w:val="single" w:sz="4" w:space="0" w:color="808080"/>
+            </w:tcBorders>
+          </w:tcPr>
+          <w:p>
+            <w:pPr>
+              <w:pStyle w:val="Normal"/>
+              <w:keepNext/>
+              <w:spacing w:before="0" w:after="0"/>
+              <w:jc w:val="center"/>
+              <w:rPr/>
+            </w:pPr>
+            <w:r>
+              <w:rPr>
+                <w:rFonts w:eastAsia="Times New Roman" w:cs="Times New Roman"/>
+                <w:sz w:val="20"/>
+                <w:szCs w:val="20"/>
+              </w:rPr>
+              <w:t xml:space="preserve">100.0</w:t>
+            </w:r>
+          </w:p>
+        </w:tc>
+        <w:tc>
+          <w:tcPr>
+            <w:tcW w:w="1500" w:type="dxa"/>
+            <w:tcBorders>
+              <w:top w:val="single" w:sz="4" w:space="0" w:color="808080"/>
+              <w:left w:val="single" w:sz="4" w:space="0" w:color="808080"/>
+              <w:bottom w:val="single" w:sz="4" w:space="0" w:color="808080"/>
+              <w:right w:val="single" w:sz="4" w:space="0" w:color="808080"/>
+            </w:tcBorders>
+          </w:tcPr>
+          <w:p>
+            <w:pPr>
+              <w:pStyle w:val="Normal"/>
+              <w:keepNext/>
+              <w:spacing w:before="0" w:after="0"/>
+              <w:jc w:val="center"/>
+              <w:rPr/>
+            </w:pPr>
+            <w:r>
+              <w:rPr>
+                <w:rFonts w:eastAsia="Times New Roman" w:cs="Times New Roman"/>
+                <w:sz w:val="20"/>
+                <w:szCs w:val="20"/>
+              </w:rPr>
+              <w:t xml:space="preserve">90.4</w:t>
+            </w:r>
+          </w:p>
+        </w:tc>
+        <w:tc>
+          <w:tcPr>
+            <w:tcW w:w="1500" w:type="dxa"/>
+            <w:tcBorders>
+              <w:top w:val="single" w:sz="4" w:space="0" w:color="808080"/>
+              <w:left w:val="single" w:sz="4" w:space="0" w:color="808080"/>
+              <w:bottom w:val="single" w:sz="4" w:space="0" w:color="808080"/>
+              <w:right w:val="single" w:sz="4" w:space="0" w:color="808080"/>
+            </w:tcBorders>
+          </w:tcPr>
+          <w:p>
+            <w:pPr>
+              <w:pStyle w:val="Normal"/>
+              <w:keepNext/>
+              <w:spacing w:before="0" w:after="0"/>
+              <w:jc w:val="center"/>
+              <w:rPr/>
+            </w:pPr>
+            <w:r>
+              <w:rPr>
+                <w:rFonts w:eastAsia="Times New Roman" w:cs="Times New Roman"/>
+                <w:sz w:val="20"/>
+                <w:szCs w:val="20"/>
+              </w:rPr>
+              <w:t xml:space="preserve">100.0</w:t>
+            </w:r>
+          </w:p>
+        </w:tc>
+      </w:tr>
+    </w:tbl>
+    <w:p>
+      <w:pPr>
+        <w:pStyle w:val="Normal"/>
+        <w:jc w:val="both"/>
+        <w:rPr/>
+      </w:pPr>
+      <w:r>
+        <w:rPr>
+          <w:rFonts w:eastAsia="Times New Roman" w:cs="Times New Roman"/>
+        </w:rPr>
+        <w:t xml:space="preserve">Four results stand out. First, monopoly prices are much less dispersed than efficient tolls. Hourly revenue-maximizing prices range from 9.5 to 12.5 under dedicated servers and from 9.5 to 11.8 under batching, against first-best tolls of 0 to 12.3 and 0.5 to 10.8. The lower end equals (V − 1)/2 = 9.5, the price of an uncongested monopolist, as Proposition 10(c) states. Second, a single revenue-maximizing price (11.2 under dedicated servers and 10.8 under batching) forgoes little revenue: 3.1% and 0.9% of the revenue of hourly prices. Third, scheduling raises welfare in this calibration, from 82.5% to 89.1% of the first best under dedicated servers and from 88.1% to 90.4% under batching. Under dedicated servers the hourly revenue-maximizing prices even yield more welfare than the best flat price chosen by a planner (89.1% against 85.3%), while under batching they do not (90.4% against 93.4%). Over the 18 configurations with V ∈ {10, 20, 40} and unpriced demand 1.2, 1.4 and 2.0 times capacity, at the measured β/α for batching, welfare is higher under hourly than under flat revenue-maximizing prices in every case, by 3.6 to 12.7 percentage points under dedicated servers and by 1.3 to 5.3 under batching, and the revenue gain is 1.1% to 8.2% and 0.5% to 2.7%. Fourth, a short schedule captures most of the gain. The best two-level schedule, with 19 lower-demand hours at 10.3 and 5 hours at 12.1 under dedicated servers (16 hours at 9.8 and 8 hours at 11.4 under batching), earns 99.2% (99.9%) of the revenue of hourly prices and recovers 73% (86%) of the revenue gain over the flat price.</w:t>
+      </w:r>
+    </w:p>
+    <w:p>
+      <w:pPr>
+        <w:pStyle w:val="Normal"/>
+        <w:jc w:val="both"/>
+        <w:rPr/>
+      </w:pPr>
+      <w:r>
+        <w:rPr>
+          <w:rFonts w:eastAsia="Times New Roman" w:cs="Times New Roman"/>
+        </w:rPr>
+        <w:t xml:space="preserve">Two implications follow. Efficient tolls earn only 73.7% (dedicated) and 79.3% (batched) of the maximal revenue, so a provider that sells capacity has no incentive to adopt them; the welfare-maximizing schedules of Sections 6.2 and 6.3 are the relevant benchmark for internal platforms and for regulators rather than a prediction for sellers. Second, the revenue-maximizing two-level schedules have a ratio of high to low price of about 1.2 (12.1/10.3 and 11.4/9.8), far below the ratio of two that DeepSeek posts. At these assumed parameters, a posted ratio of two is therefore not what revenue maximization alone would produce; as in Section 6.6, a single ratio identifies only a single parameter, and we do not read it as a test.</w:t>
+      </w:r>
+    </w:p>
+    <w:p>
+      <w:pPr>
+        <w:pStyle w:val="Heading1"/>
+        <w:rPr/>
+      </w:pPr>
+      <w:r>
+        <w:rPr>
+          <w:rFonts w:eastAsia="Times New Roman" w:cs="Times New Roman" w:ascii="Times New Roman" w:hAnsi="Times New Roman"/>
+        </w:rPr>
+        <w:t>7. Implications for Research and Practice</w:t>
+      </w:r>
+    </w:p>
+    <w:p>
+      <w:pPr>
+        <w:pStyle w:val="Heading2"/>
+        <w:rPr/>
+      </w:pPr>
+      <w:r>
+        <w:rPr>
+          <w:rFonts w:eastAsia="Times New Roman" w:cs="Times New Roman" w:ascii="Times New Roman" w:hAnsi="Times New Roman"/>
+        </w:rPr>
+        <w:t>7.1 Implications for Research</w:t>
+      </w:r>
+    </w:p>
+    <w:p>
+      <w:pPr>
+        <w:pStyle w:val="Normal"/>
+        <w:jc w:val="both"/>
+        <w:rPr/>
+      </w:pPr>
+      <w:r>
+        <w:rPr>
+          <w:rFonts w:eastAsia="Times New Roman" w:cs="Times New Roman"/>
+        </w:rPr>
+        <w:t>The classic IS theory of computing-service prices treats congestion as a stationary phenomenon and service as dedicated (Mendelson 1985, Dewan and Mendelson 1990). Our results show that the first simplification is harmless in some regimes and misleading in others, and that the dividing line is a ratio of time scales: the duration of a demand phase relative to the time the queue needs to adjust. This suggests that research on pricing AI services, and IT services more broadly, should report not only the level and dispersion of demand but also its temporal granularity. Two services with identical daily volumes and identical variance of demand can call for very different price structures if one fluctuates in bursts of seconds and the other in cycles of hours.</w:t>
+      </w:r>
+    </w:p>
+    <w:p>
+      <w:pPr>
+        <w:pStyle w:val="Normal"/>
+        <w:jc w:val="both"/>
+        <w:rPr/>
+      </w:pPr>
+      <w:r>
+        <w:rPr>
+          <w:rFonts w:eastAsia="Times New Roman" w:cs="Times New Roman"/>
+        </w:rPr>
+        <w:t>The second simplification matters because the externality that a theory prices must match the technology of service. Batched serving creates an externality that the dedicated-server model does not contain, and it changes both the level and the shape of efficient prices: quiet hours are no longer free, and schedules become flatter. The representation of the toll as overdispersion of occupancy, and the conditions under which it rises with load, carry over to any service technology that can be summarized by a completion rate that depends on the number of requests present, which makes them a portable tool for analytical IS research on shared digital infrastructure.</w:t>
+      </w:r>
+    </w:p>
+    <w:p>
+      <w:pPr>
+        <w:pStyle w:val="Normal"/>
+        <w:jc w:val="both"/>
+        <w:rPr/>
+      </w:pPr>
+      <w:r>
+        <w:rPr>
+          <w:rFonts w:eastAsia="Times New Roman" w:cs="Times New Roman"/>
+        </w:rPr>
+        <w:t>The results also bear on the IS literature that studies the menu and form of digital-service contracts. Much of that work asks which tiers or plans a provider should offer. Our analysis indicates that, for latency-sensitive services, a well-designed temporal schedule within a single tier can recover most of the welfare that hour-by-hour prices would deliver. Low-latency tiers, which providers serve with smaller batches, are a natural object for extending the model, since the slowdown externality is precisely what such tiers sell relief from.</w:t>
+      </w:r>
+    </w:p>
+    <w:p>
+      <w:pPr>
+        <w:pStyle w:val="Normal"/>
+        <w:jc w:val="both"/>
+        <w:rPr/>
+      </w:pPr>
+      <w:r>
+        <w:rPr>
+          <w:rFonts w:eastAsia="Times New Roman" w:cs="Times New Roman"/>
+        </w:rPr>
+        <w:t>Finally, the calibration illustrates a methodological point for analytical IS research. The choice of arrival model is not a technical detail. A Poisson model, an MMPP matched to second moments and a rate chain matched to the rate distribution can produce capacity requirements that differ by a factor of six on the same trace (Table 1). Analytical studies of AI services that rely on Poisson demand or on dedicated-server queues should, at a minimum, test their conclusions against trace replay on a model of the actual serving engine.</w:t>
+      </w:r>
+    </w:p>
+    <w:p>
+      <w:pPr>
+        <w:pStyle w:val="Heading2"/>
+        <w:rPr/>
+      </w:pPr>
+      <w:r>
+        <w:rPr>
+          <w:rFonts w:eastAsia="Times New Roman" w:cs="Times New Roman" w:ascii="Times New Roman" w:hAnsi="Times New Roman"/>
+        </w:rPr>
+        <w:t>7.2 Implications for Practice</w:t>
       </w:r>
     </w:p>
     <w:p>
@@ -8973,13 +12077,13 @@
           <w:b/>
           <w:bCs/>
         </w:rPr>
-        <w:t>Design of price schedules.</w:t>
-      </w:r>
-      <w:r>
-        <w:rPr>
-          <w:rFonts w:eastAsia="Times New Roman" w:cs="Times New Roman"/>
-        </w:rPr>
-        <w:t xml:space="preserve"> When demand follows a predictable daily cycle, a posted schedule with two to four price levels captures most of the attainable gain. The schedule should follow the ranking of expected demand; in the quadratic model, contiguous blocks of demand-ranked hours are optimal, and the best blocks can be computed by a simple dynamic program. The ratio between price levels needs care. Under batching, quiet hours carry a real externality, so the efficient off-peak price is not zero and the efficient ratio between peak and off-peak prices is smaller than a dedicated-server calculation would suggest. A ratio steeper than optimal can leave a schedule worse than a flat price.</w:t>
+        <w:t>Capacity planning.</w:t>
+      </w:r>
+      <w:r>
+        <w:rPr>
+          <w:rFonts w:eastAsia="Times New Roman" w:cs="Times New Roman"/>
+        </w:rPr>
+        <w:t xml:space="preserve"> Mean utilization is not a sufficient statistic for sizing a cluster. Providers and platform teams should measure both the daily profile of their demand and the burstiness that remains once that profile is removed, using their own request logs, and they should measure how the step time of their serving engine grows with the batch size. The number of engines should then be validated by replaying those logs through a model of the engine rather than computed from an Erlang formula alone, and the delay target should cover the time requests spend in the batch, not only the time they wait to enter it. In our traces, the Poisson formula was too optimistic by between 23% and more than 80% under dedicated servers and by 7% to 81% under batching.</w:t>
       </w:r>
     </w:p>
     <w:p>
@@ -8994,13 +12098,13 @@
           <w:b/>
           <w:bCs/>
         </w:rPr>
-        <w:t>When time-varying prices do not pay.</w:t>
-      </w:r>
-      <w:r>
-        <w:rPr>
-          <w:rFonts w:eastAsia="Times New Roman" w:cs="Times New Roman"/>
-        </w:rPr>
-        <w:t xml:space="preserve"> Fast fluctuations, that is, bursts shorter than a few service times, are smoothed out by the queue, and a flat price then loses little. When fluctuations consist mainly of unpredictable multi-day swings, as in the BurstGPT file, an hour-of-day schedule offers little benefit. In that case, quantity limits or real-time pricing are the relevant instruments.</w:t>
+        <w:t>Design of price schedules.</w:t>
+      </w:r>
+      <w:r>
+        <w:rPr>
+          <w:rFonts w:eastAsia="Times New Roman" w:cs="Times New Roman"/>
+        </w:rPr>
+        <w:t xml:space="preserve"> When demand follows a predictable daily cycle, a posted schedule with two to four price levels captures most of the attainable gain. The schedule should follow the ranking of expected demand; in the quadratic model, contiguous blocks of demand-ranked hours are optimal, and the best blocks can be computed by a simple dynamic program. The ratio between price levels needs care. Under batching, quiet hours carry a real externality, so the efficient off-peak price is not zero and the efficient ratio between peak and off-peak prices is smaller than a dedicated-server calculation would suggest. A ratio steeper than optimal can leave a schedule worse than a flat price.</w:t>
       </w:r>
     </w:p>
     <w:p>
@@ -9015,6 +12119,27 @@
           <w:b/>
           <w:bCs/>
         </w:rPr>
+        <w:t>When time-varying prices do not pay.</w:t>
+      </w:r>
+      <w:r>
+        <w:rPr>
+          <w:rFonts w:eastAsia="Times New Roman" w:cs="Times New Roman"/>
+        </w:rPr>
+        <w:t xml:space="preserve"> Fast fluctuations, that is, bursts shorter than a few service times, are smoothed out by the queue, and a flat price then loses little. When fluctuations consist mainly of unpredictable multi-day swings, as in the BurstGPT file, an hour-of-day schedule offers little benefit. In that case, quantity limits or real-time pricing are the relevant instruments.</w:t>
+      </w:r>
+    </w:p>
+    <w:p>
+      <w:pPr>
+        <w:pStyle w:val="Normal"/>
+        <w:jc w:val="both"/>
+        <w:rPr/>
+      </w:pPr>
+      <w:r>
+        <w:rPr>
+          <w:rFonts w:eastAsia="Times New Roman" w:cs="Times New Roman"/>
+          <w:b/>
+          <w:bCs/>
+        </w:rPr>
         <w:t>Internal platforms and enterprise buyers.</w:t>
       </w:r>
       <w:r>
@@ -9072,7 +12197,7 @@
         <w:rPr>
           <w:rFonts w:eastAsia="Times New Roman" w:cs="Times New Roman"/>
         </w:rPr>
-        <w:t>We model neither competition among providers, nor strategic behavior beyond the equilibrium of infinitesimal users, nor quantity limits as an alternative to pricing. Preliminary computations with two competing providers suggest that phase-dependent prices can raise profits without raising welfare. This possibility deserves a full treatment, because it bears on whether the time-of-day schedules now appearing in the market serve users or mainly providers. Future research could also examine how users learn the delay of each phase, how temporal schedules interact with latency tiers served with smaller batches, and how enterprise buyers reorganize their AI workloads in response to posted schedules.</w:t>
+        <w:t>Section 4.5 treats a revenue-maximizing monopolist, but we model neither competition among providers, nor strategic behavior beyond the equilibrium of infinitesimal users, nor quantity limits as an alternative to pricing. Preliminary computations with two competing providers suggest that phase-dependent prices can raise profits without raising welfare. This possibility deserves a full treatment, because it bears on whether the time-of-day schedules now appearing in the market serve users or mainly providers. Future research could also examine how users learn the delay of each phase, how temporal schedules interact with latency tiers served with smaller batches, and how enterprise buyers reorganize their AI workloads in response to posted schedules.</w:t>
       </w:r>
     </w:p>
     <w:p>
@@ -9923,7 +13048,7 @@
         <w:rPr>
           <w:rFonts w:eastAsia="Times New Roman" w:cs="Times New Roman"/>
         </w:rPr>
-        <w:t xml:space="preserve">Schweitzer PJ (1968) Perturbation theory and finite Markov chains. </w:t>
+        <w:t xml:space="preserve">Schmalensee R (1981) Output and welfare implications of monopolistic third-degree price discrimination. </w:t>
       </w:r>
       <w:r>
         <w:rPr>
@@ -9931,13 +13056,13 @@
           <w:i/>
           <w:iCs/>
         </w:rPr>
-        <w:t>J. Appl. Probab.</w:t>
-      </w:r>
-      <w:r>
-        <w:rPr>
-          <w:rFonts w:eastAsia="Times New Roman" w:cs="Times New Roman"/>
-        </w:rPr>
-        <w:t xml:space="preserve"> 5(2):401–413.</w:t>
+        <w:t>Amer. Econom. Rev.</w:t>
+      </w:r>
+      <w:r>
+        <w:rPr>
+          <w:rFonts w:eastAsia="Times New Roman" w:cs="Times New Roman"/>
+        </w:rPr>
+        <w:t xml:space="preserve"> 71(1):242–247.</w:t>
       </w:r>
     </w:p>
     <w:p>
@@ -9951,7 +13076,7 @@
         <w:rPr>
           <w:rFonts w:eastAsia="Times New Roman" w:cs="Times New Roman"/>
         </w:rPr>
-        <w:t xml:space="preserve">Steiner PO (1957) Peak loads and efficient pricing. </w:t>
+        <w:t xml:space="preserve">Schweitzer PJ (1968) Perturbation theory and finite Markov chains. </w:t>
       </w:r>
       <w:r>
         <w:rPr>
@@ -9959,13 +13084,13 @@
           <w:i/>
           <w:iCs/>
         </w:rPr>
-        <w:t>Quart. J. Econom.</w:t>
-      </w:r>
-      <w:r>
-        <w:rPr>
-          <w:rFonts w:eastAsia="Times New Roman" w:cs="Times New Roman"/>
-        </w:rPr>
-        <w:t xml:space="preserve"> 71(4):585–610.</w:t>
+        <w:t>J. Appl. Probab.</w:t>
+      </w:r>
+      <w:r>
+        <w:rPr>
+          <w:rFonts w:eastAsia="Times New Roman" w:cs="Times New Roman"/>
+        </w:rPr>
+        <w:t xml:space="preserve"> 5(2):401–413.</w:t>
       </w:r>
     </w:p>
     <w:p>
@@ -9979,7 +13104,7 @@
         <w:rPr>
           <w:rFonts w:eastAsia="Times New Roman" w:cs="Times New Roman"/>
         </w:rPr>
-        <w:t xml:space="preserve">Stojkovic J, Zhang C, Goiri Í, Torrellas J, Choukse E (2025) DynamoLLM: Designing LLM inference clusters for performance and energy efficiency. </w:t>
+        <w:t xml:space="preserve">Steiner PO (1957) Peak loads and efficient pricing. </w:t>
       </w:r>
       <w:r>
         <w:rPr>
@@ -9987,13 +13112,13 @@
           <w:i/>
           <w:iCs/>
         </w:rPr>
-        <w:t>Proc. 2025 IEEE Internat. Sympos. High Performance Comput. Architecture (HPCA)</w:t>
-      </w:r>
-      <w:r>
-        <w:rPr>
-          <w:rFonts w:eastAsia="Times New Roman" w:cs="Times New Roman"/>
-        </w:rPr>
-        <w:t xml:space="preserve"> (IEEE, Piscataway, NJ), 1348–1362.</w:t>
+        <w:t>Quart. J. Econom.</w:t>
+      </w:r>
+      <w:r>
+        <w:rPr>
+          <w:rFonts w:eastAsia="Times New Roman" w:cs="Times New Roman"/>
+        </w:rPr>
+        <w:t xml:space="preserve"> 71(4):585–610.</w:t>
       </w:r>
     </w:p>
     <w:p>
@@ -10007,7 +13132,7 @@
         <w:rPr>
           <w:rFonts w:eastAsia="Times New Roman" w:cs="Times New Roman"/>
         </w:rPr>
-        <w:t xml:space="preserve">Sundararajan A (2004) Nonlinear pricing of information goods. </w:t>
+        <w:t xml:space="preserve">Stojkovic J, Zhang C, Goiri Í, Torrellas J, Choukse E (2025) DynamoLLM: Designing LLM inference clusters for performance and energy efficiency. </w:t>
       </w:r>
       <w:r>
         <w:rPr>
@@ -10015,6 +13140,34 @@
           <w:i/>
           <w:iCs/>
         </w:rPr>
+        <w:t>Proc. 2025 IEEE Internat. Sympos. High Performance Comput. Architecture (HPCA)</w:t>
+      </w:r>
+      <w:r>
+        <w:rPr>
+          <w:rFonts w:eastAsia="Times New Roman" w:cs="Times New Roman"/>
+        </w:rPr>
+        <w:t xml:space="preserve"> (IEEE, Piscataway, NJ), 1348–1362.</w:t>
+      </w:r>
+    </w:p>
+    <w:p>
+      <w:pPr>
+        <w:pStyle w:val="Normal"/>
+        <w:ind w:hanging="360" w:left="360"/>
+        <w:jc w:val="left"/>
+        <w:rPr/>
+      </w:pPr>
+      <w:r>
+        <w:rPr>
+          <w:rFonts w:eastAsia="Times New Roman" w:cs="Times New Roman"/>
+        </w:rPr>
+        <w:t xml:space="preserve">Sundararajan A (2004) Nonlinear pricing of information goods. </w:t>
+      </w:r>
+      <w:r>
+        <w:rPr>
+          <w:rFonts w:eastAsia="Times New Roman" w:cs="Times New Roman"/>
+          <w:i/>
+          <w:iCs/>
+        </w:rPr>
         <w:t>Management Sci.</w:t>
       </w:r>
       <w:r>
@@ -10022,6 +13175,34 @@
           <w:rFonts w:eastAsia="Times New Roman" w:cs="Times New Roman"/>
         </w:rPr>
         <w:t xml:space="preserve"> 50(12):1660–1673.</w:t>
+      </w:r>
+    </w:p>
+    <w:p>
+      <w:pPr>
+        <w:pStyle w:val="Normal"/>
+        <w:ind w:hanging="360" w:left="360"/>
+        <w:jc w:val="left"/>
+        <w:rPr/>
+      </w:pPr>
+      <w:r>
+        <w:rPr>
+          <w:rFonts w:eastAsia="Times New Roman" w:cs="Times New Roman"/>
+        </w:rPr>
+        <w:t xml:space="preserve">Varian HR (1985) Price discrimination and social welfare. </w:t>
+      </w:r>
+      <w:r>
+        <w:rPr>
+          <w:rFonts w:eastAsia="Times New Roman" w:cs="Times New Roman"/>
+          <w:i/>
+          <w:iCs/>
+        </w:rPr>
+        <w:t>Amer. Econom. Rev.</w:t>
+      </w:r>
+      <w:r>
+        <w:rPr>
+          <w:rFonts w:eastAsia="Times New Roman" w:cs="Times New Roman"/>
+        </w:rPr>
+        <w:t xml:space="preserve"> 75(4):870–875.</w:t>
       </w:r>
     </w:p>
     <w:p>

</xml_diff>